<commit_message>
fix: tidy Purchase Risk Summary output
- Removed the Expected Receipt column, which read the header-level
  date that this version doesn't expose (always blank). The Overdue
  column already reflects the line-level overdue logic.
- Scores for Insufficient Data vendors now print blank instead of 0,
  since a printed 0 reads as a measured 0% rather than "not yet rated".
</commit_message>
<xml_diff>
--- a/src/Reports/Layouts/PurchaseRiskSummary.docx
+++ b/src/Reports/Layouts/PurchaseRiskSummary.docx
@@ -4,14 +4,14 @@
   <w:body>
     <w:sdt>
       <w:sdtPr>
+        <w:alias w:val="#Nav: /BCReportInformation/CompanyMetadata/CompanyName"/>
+        <w:tag w:val="#Nav: PCX_Purchase_Risk_Summary/51100"/>
         <w:id w:val="-106351848"/>
         <w:placeholder>
           <w:docPart w:val="DefaultPlaceholder_-1854013440"/>
         </w:placeholder>
         <w:dataBinding w:prefixMappings="xmlns:ns0='urn:microsoft-dynamics-nav/reports/PCX_Purchase_Risk_Summary/51100/' " w:xpath="/ns0:NavWordReportXmlPart[1]/ns0:BCReportInformation[1]/ns0:CompanyMetadata[1]/ns0:CompanyName[1]" w:storeItemID="{DA5D4310-D13F-432C-84F0-FA8B9D237202}"/>
         <w:text/>
-        <w:alias w:val="#Nav: /BCReportInformation/CompanyMetadata/CompanyName"/>
-        <w:tag w:val="#Nav: PCX_Purchase_Risk_Summary/51100"/>
       </w:sdtPr>
       <w:sdtContent>
         <w:p>
@@ -60,14 +60,14 @@
       </w:r>
       <w:sdt>
         <w:sdtPr>
+          <w:alias w:val="#Nav: /BCReportInformation/ReportRequest/DateAndTime"/>
+          <w:tag w:val="#Nav: PCX_Purchase_Risk_Summary/51100"/>
           <w:id w:val="1891768189"/>
           <w:placeholder>
             <w:docPart w:val="DefaultPlaceholder_-1854013440"/>
           </w:placeholder>
           <w:dataBinding w:prefixMappings="xmlns:ns0='urn:microsoft-dynamics-nav/reports/PCX_Purchase_Risk_Summary/51100/' " w:xpath="/ns0:NavWordReportXmlPart[1]/ns0:BCReportInformation[1]/ns0:ReportRequest[1]/ns0:DateAndTime[1]" w:storeItemID="{DA5D4310-D13F-432C-84F0-FA8B9D237202}"/>
           <w:text/>
-          <w:alias w:val="#Nav: /BCReportInformation/ReportRequest/DateAndTime"/>
-          <w:tag w:val="#Nav: PCX_Purchase_Risk_Summary/51100"/>
         </w:sdtPr>
         <w:sdtContent>
           <w:r>
@@ -80,6 +80,7 @@
       <w:pPr>
         <w:pStyle w:val="Heading2"/>
         <w:spacing w:before="300" w:after="120"/>
+        <w:jc w:val="both"/>
       </w:pPr>
       <w:r>
         <w:rPr>
@@ -94,7 +95,7 @@
     </w:p>
     <w:tbl>
       <w:tblPr>
-        <w:tblW w:w="14040" w:type="dxa"/>
+        <w:tblW w:w="11666" w:type="dxa"/>
         <w:tblBorders>
           <w:top w:val="single" w:color="auto" w:sz="4" w:space="0"/>
           <w:left w:val="single" w:color="auto" w:sz="4" w:space="0"/>
@@ -113,24 +114,17 @@
         <w:gridCol w:w="1301"/>
         <w:gridCol w:w="2087"/>
         <w:gridCol w:w="2704"/>
-        <w:gridCol w:w="2374"/>
         <w:gridCol w:w="1302"/>
         <w:gridCol w:w="2303"/>
         <w:gridCol w:w="1969"/>
       </w:tblGrid>
       <w:tr>
-        <w:tblPrEx>
-          <w:tblCellMar>
-            <w:top w:w="0" w:type="dxa"/>
-            <w:bottom w:w="0" w:type="dxa"/>
-          </w:tblCellMar>
-        </w:tblPrEx>
         <w:trPr>
           <w:tblHeader/>
         </w:trPr>
         <w:tc>
           <w:tcPr>
-            <w:tcW w:w="1300" w:type="dxa"/>
+            <w:tcW w:w="1301" w:type="dxa"/>
             <w:tcBorders>
               <w:top w:val="single" w:color="D9D9D9" w:sz="4" w:space="0"/>
               <w:left w:val="single" w:color="D9D9D9" w:sz="4" w:space="0"/>
@@ -146,6 +140,9 @@
             </w:tcMar>
           </w:tcPr>
           <w:p>
+            <w:pPr>
+              <w:jc w:val="both"/>
+            </w:pPr>
             <w:r>
               <w:rPr>
                 <w:b/>
@@ -160,7 +157,7 @@
         </w:tc>
         <w:tc>
           <w:tcPr>
-            <w:tcW w:w="1500" w:type="dxa"/>
+            <w:tcW w:w="2087" w:type="dxa"/>
             <w:tcBorders>
               <w:top w:val="single" w:color="D9D9D9" w:sz="4" w:space="0"/>
               <w:left w:val="single" w:color="D9D9D9" w:sz="4" w:space="0"/>
@@ -176,6 +173,9 @@
             </w:tcMar>
           </w:tcPr>
           <w:p>
+            <w:pPr>
+              <w:jc w:val="both"/>
+            </w:pPr>
             <w:r>
               <w:rPr>
                 <w:b/>
@@ -190,7 +190,7 @@
         </w:tc>
         <w:tc>
           <w:tcPr>
-            <w:tcW w:w="2700" w:type="dxa"/>
+            <w:tcW w:w="2704" w:type="dxa"/>
             <w:tcBorders>
               <w:top w:val="single" w:color="D9D9D9" w:sz="4" w:space="0"/>
               <w:left w:val="single" w:color="D9D9D9" w:sz="4" w:space="0"/>
@@ -206,6 +206,9 @@
             </w:tcMar>
           </w:tcPr>
           <w:p>
+            <w:pPr>
+              <w:jc w:val="both"/>
+            </w:pPr>
             <w:r>
               <w:rPr>
                 <w:b/>
@@ -220,7 +223,7 @@
         </w:tc>
         <w:tc>
           <w:tcPr>
-            <w:tcW w:w="1600" w:type="dxa"/>
+            <w:tcW w:w="1302" w:type="dxa"/>
             <w:tcBorders>
               <w:top w:val="single" w:color="D9D9D9" w:sz="4" w:space="0"/>
               <w:left w:val="single" w:color="D9D9D9" w:sz="4" w:space="0"/>
@@ -236,6 +239,9 @@
             </w:tcMar>
           </w:tcPr>
           <w:p>
+            <w:pPr>
+              <w:jc w:val="both"/>
+            </w:pPr>
             <w:r>
               <w:rPr>
                 <w:b/>
@@ -244,13 +250,13 @@
                 <w:sz w:val="16"/>
                 <w:szCs w:val="16"/>
               </w:rPr>
-              <w:t>Expected Receipt</w:t>
+              <w:t>Risk Level</w:t>
             </w:r>
           </w:p>
         </w:tc>
         <w:tc>
           <w:tcPr>
-            <w:tcW w:w="1300" w:type="dxa"/>
+            <w:tcW w:w="2303" w:type="dxa"/>
             <w:tcBorders>
               <w:top w:val="single" w:color="D9D9D9" w:sz="4" w:space="0"/>
               <w:left w:val="single" w:color="D9D9D9" w:sz="4" w:space="0"/>
@@ -266,6 +272,9 @@
             </w:tcMar>
           </w:tcPr>
           <w:p>
+            <w:pPr>
+              <w:jc w:val="both"/>
+            </w:pPr>
             <w:r>
               <w:rPr>
                 <w:b/>
@@ -274,13 +283,13 @@
                 <w:sz w:val="16"/>
                 <w:szCs w:val="16"/>
               </w:rPr>
-              <w:t>Risk Level</w:t>
+              <w:t>Match Status</w:t>
             </w:r>
           </w:p>
         </w:tc>
         <w:tc>
           <w:tcPr>
-            <w:tcW w:w="2300" w:type="dxa"/>
+            <w:tcW w:w="1969" w:type="dxa"/>
             <w:tcBorders>
               <w:top w:val="single" w:color="D9D9D9" w:sz="4" w:space="0"/>
               <w:left w:val="single" w:color="D9D9D9" w:sz="4" w:space="0"/>
@@ -296,36 +305,9 @@
             </w:tcMar>
           </w:tcPr>
           <w:p>
-            <w:r>
-              <w:rPr>
-                <w:b/>
-                <w:bCs/>
-                <w:color w:val="FFFFFF"/>
-                <w:sz w:val="16"/>
-                <w:szCs w:val="16"/>
-              </w:rPr>
-              <w:t>Match Status</w:t>
-            </w:r>
-          </w:p>
-        </w:tc>
-        <w:tc>
-          <w:tcPr>
-            <w:tcW w:w="1800" w:type="dxa"/>
-            <w:tcBorders>
-              <w:top w:val="single" w:color="D9D9D9" w:sz="4" w:space="0"/>
-              <w:left w:val="single" w:color="D9D9D9" w:sz="4" w:space="0"/>
-              <w:bottom w:val="single" w:color="D9D9D9" w:sz="4" w:space="0"/>
-              <w:right w:val="single" w:color="D9D9D9" w:sz="4" w:space="0"/>
-            </w:tcBorders>
-            <w:shd w:val="clear" w:color="auto" w:fill="1F3864"/>
-            <w:tcMar>
-              <w:top w:w="60" w:type="dxa"/>
-              <w:left w:w="60" w:type="dxa"/>
-              <w:bottom w:w="60" w:type="dxa"/>
-              <w:right w:w="60" w:type="dxa"/>
-            </w:tcMar>
-          </w:tcPr>
-          <w:p>
+            <w:pPr>
+              <w:jc w:val="both"/>
+            </w:pPr>
             <w:r>
               <w:rPr>
                 <w:b/>
@@ -341,44 +323,38 @@
       </w:tr>
       <w:sdt>
         <w:sdtPr>
+          <w:alias w:val="#Nav: /OpenRiskOrders"/>
+          <w:tag w:val="#Nav: PCX_Purchase_Risk_Summary/51100"/>
           <w:id w:val="-1331598159"/>
           <w15:dataBinding w:prefixMappings="xmlns:ns0='urn:microsoft-dynamics-nav/reports/PCX_Purchase_Risk_Summary/51100/' " w:xpath="/ns0:NavWordReportXmlPart[1]/ns0:OpenRiskOrders" w:storeItemID="{DA5D4310-D13F-432C-84F0-FA8B9D237202}"/>
           <w15:repeatingSection/>
-          <w:alias w:val="#Nav: /OpenRiskOrders"/>
-          <w:tag w:val="#Nav: PCX_Purchase_Risk_Summary/51100"/>
         </w:sdtPr>
         <w:sdtContent>
           <w:sdt>
             <w:sdtPr>
               <w:id w:val="486594763"/>
               <w:placeholder>
-                <w:docPart w:val="DefaultPlaceholder_-1854013435"/>
+                <w:docPart w:val="61B927D255664D2EA4B29BE6E2E2CDCB"/>
               </w:placeholder>
               <w15:repeatingSectionItem/>
             </w:sdtPr>
             <w:sdtContent>
               <w:tr>
-                <w:tblPrEx>
-                  <w:tblCellMar>
-                    <w:top w:w="0" w:type="dxa"/>
-                    <w:bottom w:w="0" w:type="dxa"/>
-                  </w:tblCellMar>
-                </w:tblPrEx>
                 <w:sdt>
                   <w:sdtPr>
+                    <w:alias w:val="#Nav: /OpenRiskOrders/No_"/>
+                    <w:tag w:val="#Nav: PCX_Purchase_Risk_Summary/51100"/>
                     <w:id w:val="-1169011569"/>
                     <w:placeholder>
-                      <w:docPart w:val="DefaultPlaceholder_-1854013440"/>
+                      <w:docPart w:val="0580506ADACC4BB399022E5AEC4852A3"/>
                     </w:placeholder>
                     <w:dataBinding w:prefixMappings="xmlns:ns0='urn:microsoft-dynamics-nav/reports/PCX_Purchase_Risk_Summary/51100/' " w:xpath="/ns0:NavWordReportXmlPart[1]/ns0:OpenRiskOrders[1]/ns0:No_[1]" w:storeItemID="{DA5D4310-D13F-432C-84F0-FA8B9D237202}"/>
                     <w:text/>
-                    <w:alias w:val="#Nav: /OpenRiskOrders/No_"/>
-                    <w:tag w:val="#Nav: PCX_Purchase_Risk_Summary/51100"/>
                   </w:sdtPr>
                   <w:sdtContent>
                     <w:tc>
                       <w:tcPr>
-                        <w:tcW w:w="1300" w:type="dxa"/>
+                        <w:tcW w:w="1301" w:type="dxa"/>
                         <w:tcBorders>
                           <w:top w:val="single" w:color="D9D9D9" w:sz="4" w:space="0"/>
                           <w:left w:val="single" w:color="D9D9D9" w:sz="4" w:space="0"/>
@@ -394,6 +370,9 @@
                         </w:tcMar>
                       </w:tcPr>
                       <w:p>
+                        <w:pPr>
+                          <w:jc w:val="both"/>
+                        </w:pPr>
                         <w:r>
                           <w:t>No_</w:t>
                         </w:r>
@@ -403,19 +382,19 @@
                 </w:sdt>
                 <w:sdt>
                   <w:sdtPr>
+                    <w:alias w:val="#Nav: /OpenRiskOrders/BuyFromVendorNo"/>
+                    <w:tag w:val="#Nav: PCX_Purchase_Risk_Summary/51100"/>
                     <w:id w:val="-631627403"/>
                     <w:placeholder>
-                      <w:docPart w:val="DefaultPlaceholder_-1854013440"/>
+                      <w:docPart w:val="0580506ADACC4BB399022E5AEC4852A3"/>
                     </w:placeholder>
                     <w:dataBinding w:prefixMappings="xmlns:ns0='urn:microsoft-dynamics-nav/reports/PCX_Purchase_Risk_Summary/51100/' " w:xpath="/ns0:NavWordReportXmlPart[1]/ns0:OpenRiskOrders[1]/ns0:BuyFromVendorNo[1]" w:storeItemID="{DA5D4310-D13F-432C-84F0-FA8B9D237202}"/>
                     <w:text/>
-                    <w:alias w:val="#Nav: /OpenRiskOrders/BuyFromVendorNo"/>
-                    <w:tag w:val="#Nav: PCX_Purchase_Risk_Summary/51100"/>
                   </w:sdtPr>
                   <w:sdtContent>
                     <w:tc>
                       <w:tcPr>
-                        <w:tcW w:w="1500" w:type="dxa"/>
+                        <w:tcW w:w="2087" w:type="dxa"/>
                         <w:tcBorders>
                           <w:top w:val="single" w:color="D9D9D9" w:sz="4" w:space="0"/>
                           <w:left w:val="single" w:color="D9D9D9" w:sz="4" w:space="0"/>
@@ -431,6 +410,9 @@
                         </w:tcMar>
                       </w:tcPr>
                       <w:p>
+                        <w:pPr>
+                          <w:jc w:val="both"/>
+                        </w:pPr>
                         <w:proofErr w:type="spellStart"/>
                         <w:r>
                           <w:t>BuyFromVendorNo</w:t>
@@ -442,19 +424,19 @@
                 </w:sdt>
                 <w:sdt>
                   <w:sdtPr>
+                    <w:alias w:val="#Nav: /OpenRiskOrders/BuyFromVendorName"/>
+                    <w:tag w:val="#Nav: PCX_Purchase_Risk_Summary/51100"/>
                     <w:id w:val="-1869056426"/>
                     <w:placeholder>
-                      <w:docPart w:val="DefaultPlaceholder_-1854013440"/>
+                      <w:docPart w:val="0580506ADACC4BB399022E5AEC4852A3"/>
                     </w:placeholder>
                     <w:dataBinding w:prefixMappings="xmlns:ns0='urn:microsoft-dynamics-nav/reports/PCX_Purchase_Risk_Summary/51100/' " w:xpath="/ns0:NavWordReportXmlPart[1]/ns0:OpenRiskOrders[1]/ns0:BuyFromVendorName[1]" w:storeItemID="{DA5D4310-D13F-432C-84F0-FA8B9D237202}"/>
                     <w:text/>
-                    <w:alias w:val="#Nav: /OpenRiskOrders/BuyFromVendorName"/>
-                    <w:tag w:val="#Nav: PCX_Purchase_Risk_Summary/51100"/>
                   </w:sdtPr>
                   <w:sdtContent>
                     <w:tc>
                       <w:tcPr>
-                        <w:tcW w:w="2700" w:type="dxa"/>
+                        <w:tcW w:w="2704" w:type="dxa"/>
                         <w:tcBorders>
                           <w:top w:val="single" w:color="D9D9D9" w:sz="4" w:space="0"/>
                           <w:left w:val="single" w:color="D9D9D9" w:sz="4" w:space="0"/>
@@ -470,6 +452,9 @@
                         </w:tcMar>
                       </w:tcPr>
                       <w:p>
+                        <w:pPr>
+                          <w:jc w:val="both"/>
+                        </w:pPr>
                         <w:proofErr w:type="spellStart"/>
                         <w:r>
                           <w:t>BuyFromVendorName</w:t>
@@ -481,19 +466,19 @@
                 </w:sdt>
                 <w:sdt>
                   <w:sdtPr>
-                    <w:id w:val="-1553224839"/>
+                    <w:alias w:val="#Nav: /OpenRiskOrders/RiskLevel"/>
+                    <w:tag w:val="#Nav: PCX_Purchase_Risk_Summary/51100"/>
+                    <w:id w:val="-1839371775"/>
                     <w:placeholder>
-                      <w:docPart w:val="DefaultPlaceholder_-1854013440"/>
+                      <w:docPart w:val="0580506ADACC4BB399022E5AEC4852A3"/>
                     </w:placeholder>
-                    <w:dataBinding w:prefixMappings="xmlns:ns0='urn:microsoft-dynamics-nav/reports/PCX_Purchase_Risk_Summary/51100/' " w:xpath="/ns0:NavWordReportXmlPart[1]/ns0:OpenRiskOrders[1]/ns0:ExpectedReceiptDate[1]" w:storeItemID="{DA5D4310-D13F-432C-84F0-FA8B9D237202}"/>
+                    <w:dataBinding w:prefixMappings="xmlns:ns0='urn:microsoft-dynamics-nav/reports/PCX_Purchase_Risk_Summary/51100/' " w:xpath="/ns0:NavWordReportXmlPart[1]/ns0:OpenRiskOrders[1]/ns0:RiskLevel[1]" w:storeItemID="{DA5D4310-D13F-432C-84F0-FA8B9D237202}"/>
                     <w:text/>
-                    <w:alias w:val="#Nav: /OpenRiskOrders/ExpectedReceiptDate"/>
-                    <w:tag w:val="#Nav: PCX_Purchase_Risk_Summary/51100"/>
                   </w:sdtPr>
                   <w:sdtContent>
                     <w:tc>
                       <w:tcPr>
-                        <w:tcW w:w="1600" w:type="dxa"/>
+                        <w:tcW w:w="1302" w:type="dxa"/>
                         <w:tcBorders>
                           <w:top w:val="single" w:color="D9D9D9" w:sz="4" w:space="0"/>
                           <w:left w:val="single" w:color="D9D9D9" w:sz="4" w:space="0"/>
@@ -509,9 +494,12 @@
                         </w:tcMar>
                       </w:tcPr>
                       <w:p>
+                        <w:pPr>
+                          <w:jc w:val="both"/>
+                        </w:pPr>
                         <w:proofErr w:type="spellStart"/>
                         <w:r>
-                          <w:t>ExpectedReceiptDate</w:t>
+                          <w:t>RiskLevel</w:t>
                         </w:r>
                         <w:proofErr w:type="spellEnd"/>
                       </w:p>
@@ -520,19 +508,19 @@
                 </w:sdt>
                 <w:sdt>
                   <w:sdtPr>
-                    <w:id w:val="-1839371775"/>
+                    <w:alias w:val="#Nav: /OpenRiskOrders/MatchStatus"/>
+                    <w:tag w:val="#Nav: PCX_Purchase_Risk_Summary/51100"/>
+                    <w:id w:val="-286063"/>
                     <w:placeholder>
-                      <w:docPart w:val="DefaultPlaceholder_-1854013440"/>
+                      <w:docPart w:val="0580506ADACC4BB399022E5AEC4852A3"/>
                     </w:placeholder>
-                    <w:dataBinding w:prefixMappings="xmlns:ns0='urn:microsoft-dynamics-nav/reports/PCX_Purchase_Risk_Summary/51100/' " w:xpath="/ns0:NavWordReportXmlPart[1]/ns0:OpenRiskOrders[1]/ns0:RiskLevel[1]" w:storeItemID="{DA5D4310-D13F-432C-84F0-FA8B9D237202}"/>
+                    <w:dataBinding w:prefixMappings="xmlns:ns0='urn:microsoft-dynamics-nav/reports/PCX_Purchase_Risk_Summary/51100/' " w:xpath="/ns0:NavWordReportXmlPart[1]/ns0:OpenRiskOrders[1]/ns0:MatchStatus[1]" w:storeItemID="{DA5D4310-D13F-432C-84F0-FA8B9D237202}"/>
                     <w:text/>
-                    <w:alias w:val="#Nav: /OpenRiskOrders/RiskLevel"/>
-                    <w:tag w:val="#Nav: PCX_Purchase_Risk_Summary/51100"/>
                   </w:sdtPr>
                   <w:sdtContent>
                     <w:tc>
                       <w:tcPr>
-                        <w:tcW w:w="1300" w:type="dxa"/>
+                        <w:tcW w:w="2303" w:type="dxa"/>
                         <w:tcBorders>
                           <w:top w:val="single" w:color="D9D9D9" w:sz="4" w:space="0"/>
                           <w:left w:val="single" w:color="D9D9D9" w:sz="4" w:space="0"/>
@@ -548,9 +536,12 @@
                         </w:tcMar>
                       </w:tcPr>
                       <w:p>
+                        <w:pPr>
+                          <w:jc w:val="both"/>
+                        </w:pPr>
                         <w:proofErr w:type="spellStart"/>
                         <w:r>
-                          <w:t>RiskLevel</w:t>
+                          <w:t>MatchStatus</w:t>
                         </w:r>
                         <w:proofErr w:type="spellEnd"/>
                       </w:p>
@@ -559,19 +550,19 @@
                 </w:sdt>
                 <w:sdt>
                   <w:sdtPr>
-                    <w:id w:val="-286063"/>
+                    <w:alias w:val="#Nav: /OpenRiskOrders/CurrentlyOverdue"/>
+                    <w:tag w:val="#Nav: PCX_Purchase_Risk_Summary/51100"/>
+                    <w:id w:val="457844358"/>
                     <w:placeholder>
-                      <w:docPart w:val="DefaultPlaceholder_-1854013440"/>
+                      <w:docPart w:val="0580506ADACC4BB399022E5AEC4852A3"/>
                     </w:placeholder>
-                    <w:dataBinding w:prefixMappings="xmlns:ns0='urn:microsoft-dynamics-nav/reports/PCX_Purchase_Risk_Summary/51100/' " w:xpath="/ns0:NavWordReportXmlPart[1]/ns0:OpenRiskOrders[1]/ns0:MatchStatus[1]" w:storeItemID="{DA5D4310-D13F-432C-84F0-FA8B9D237202}"/>
+                    <w:dataBinding w:prefixMappings="xmlns:ns0='urn:microsoft-dynamics-nav/reports/PCX_Purchase_Risk_Summary/51100/' " w:xpath="/ns0:NavWordReportXmlPart[1]/ns0:OpenRiskOrders[1]/ns0:CurrentlyOverdue[1]" w:storeItemID="{DA5D4310-D13F-432C-84F0-FA8B9D237202}"/>
                     <w:text/>
-                    <w:alias w:val="#Nav: /OpenRiskOrders/MatchStatus"/>
-                    <w:tag w:val="#Nav: PCX_Purchase_Risk_Summary/51100"/>
                   </w:sdtPr>
                   <w:sdtContent>
                     <w:tc>
                       <w:tcPr>
-                        <w:tcW w:w="2300" w:type="dxa"/>
+                        <w:tcW w:w="1969" w:type="dxa"/>
                         <w:tcBorders>
                           <w:top w:val="single" w:color="D9D9D9" w:sz="4" w:space="0"/>
                           <w:left w:val="single" w:color="D9D9D9" w:sz="4" w:space="0"/>
@@ -587,45 +578,9 @@
                         </w:tcMar>
                       </w:tcPr>
                       <w:p>
-                        <w:proofErr w:type="spellStart"/>
-                        <w:r>
-                          <w:t>MatchStatus</w:t>
-                        </w:r>
-                        <w:proofErr w:type="spellEnd"/>
-                      </w:p>
-                    </w:tc>
-                  </w:sdtContent>
-                </w:sdt>
-                <w:sdt>
-                  <w:sdtPr>
-                    <w:id w:val="457844358"/>
-                    <w:placeholder>
-                      <w:docPart w:val="DefaultPlaceholder_-1854013440"/>
-                    </w:placeholder>
-                    <w:dataBinding w:prefixMappings="xmlns:ns0='urn:microsoft-dynamics-nav/reports/PCX_Purchase_Risk_Summary/51100/' " w:xpath="/ns0:NavWordReportXmlPart[1]/ns0:OpenRiskOrders[1]/ns0:CurrentlyOverdue[1]" w:storeItemID="{DA5D4310-D13F-432C-84F0-FA8B9D237202}"/>
-                    <w:text/>
-                    <w:alias w:val="#Nav: /OpenRiskOrders/CurrentlyOverdue"/>
-                    <w:tag w:val="#Nav: PCX_Purchase_Risk_Summary/51100"/>
-                  </w:sdtPr>
-                  <w:sdtContent>
-                    <w:tc>
-                      <w:tcPr>
-                        <w:tcW w:w="1800" w:type="dxa"/>
-                        <w:tcBorders>
-                          <w:top w:val="single" w:color="D9D9D9" w:sz="4" w:space="0"/>
-                          <w:left w:val="single" w:color="D9D9D9" w:sz="4" w:space="0"/>
-                          <w:bottom w:val="single" w:color="D9D9D9" w:sz="4" w:space="0"/>
-                          <w:right w:val="single" w:color="D9D9D9" w:sz="4" w:space="0"/>
-                        </w:tcBorders>
-                        <w:shd w:val="clear" w:color="auto" w:fill="FFFFFF"/>
-                        <w:tcMar>
-                          <w:top w:w="50" w:type="dxa"/>
-                          <w:left w:w="60" w:type="dxa"/>
-                          <w:bottom w:w="50" w:type="dxa"/>
-                          <w:right w:w="60" w:type="dxa"/>
-                        </w:tcMar>
-                      </w:tcPr>
-                      <w:p>
+                        <w:pPr>
+                          <w:jc w:val="both"/>
+                        </w:pPr>
                         <w:proofErr w:type="spellStart"/>
                         <w:r>
                           <w:t>CurrentlyOverdue</w:t>
@@ -641,11 +596,16 @@
         </w:sdtContent>
       </w:sdt>
     </w:tbl>
-    <w:p/>
+    <w:p>
+      <w:pPr>
+        <w:jc w:val="both"/>
+      </w:pPr>
+    </w:p>
     <w:p>
       <w:pPr>
         <w:pStyle w:val="Heading2"/>
         <w:spacing w:before="300" w:after="120"/>
+        <w:jc w:val="both"/>
       </w:pPr>
       <w:r>
         <w:rPr>
@@ -676,21 +636,15 @@
         <w:tblLook w:val="0000" w:firstRow="0" w:lastRow="0" w:firstColumn="0" w:lastColumn="0" w:noHBand="0" w:noVBand="0"/>
       </w:tblPr>
       <w:tblGrid>
-        <w:gridCol w:w="1719"/>
-        <w:gridCol w:w="2328"/>
-        <w:gridCol w:w="1720"/>
-        <w:gridCol w:w="2034"/>
-        <w:gridCol w:w="2226"/>
-        <w:gridCol w:w="1949"/>
-        <w:gridCol w:w="2064"/>
+        <w:gridCol w:w="1632"/>
+        <w:gridCol w:w="2210"/>
+        <w:gridCol w:w="1682"/>
+        <w:gridCol w:w="2249"/>
+        <w:gridCol w:w="2429"/>
+        <w:gridCol w:w="1879"/>
+        <w:gridCol w:w="1959"/>
       </w:tblGrid>
       <w:tr>
-        <w:tblPrEx>
-          <w:tblCellMar>
-            <w:top w:w="0" w:type="dxa"/>
-            <w:bottom w:w="0" w:type="dxa"/>
-          </w:tblCellMar>
-        </w:tblPrEx>
         <w:trPr>
           <w:tblHeader/>
         </w:trPr>
@@ -712,6 +666,9 @@
             </w:tcMar>
           </w:tcPr>
           <w:p>
+            <w:pPr>
+              <w:jc w:val="both"/>
+            </w:pPr>
             <w:r>
               <w:rPr>
                 <w:b/>
@@ -742,6 +699,9 @@
             </w:tcMar>
           </w:tcPr>
           <w:p>
+            <w:pPr>
+              <w:jc w:val="both"/>
+            </w:pPr>
             <w:r>
               <w:rPr>
                 <w:b/>
@@ -772,6 +732,9 @@
             </w:tcMar>
           </w:tcPr>
           <w:p>
+            <w:pPr>
+              <w:jc w:val="both"/>
+            </w:pPr>
             <w:r>
               <w:rPr>
                 <w:b/>
@@ -802,6 +765,9 @@
             </w:tcMar>
           </w:tcPr>
           <w:p>
+            <w:pPr>
+              <w:jc w:val="both"/>
+            </w:pPr>
             <w:r>
               <w:rPr>
                 <w:b/>
@@ -832,6 +798,9 @@
             </w:tcMar>
           </w:tcPr>
           <w:p>
+            <w:pPr>
+              <w:jc w:val="both"/>
+            </w:pPr>
             <w:r>
               <w:rPr>
                 <w:b/>
@@ -862,6 +831,9 @@
             </w:tcMar>
           </w:tcPr>
           <w:p>
+            <w:pPr>
+              <w:jc w:val="both"/>
+            </w:pPr>
             <w:r>
               <w:rPr>
                 <w:b/>
@@ -892,6 +864,9 @@
             </w:tcMar>
           </w:tcPr>
           <w:p>
+            <w:pPr>
+              <w:jc w:val="both"/>
+            </w:pPr>
             <w:r>
               <w:rPr>
                 <w:b/>
@@ -907,7 +882,7 @@
       </w:tr>
       <w:sdt>
         <w:sdtPr>
-          <w:id w:val="691349604"/>
+          <w:id w:val="-1811465031"/>
           <w15:dataBinding w:prefixMappings="xmlns:ns0='urn:microsoft-dynamics-nav/reports/PCX_Purchase_Risk_Summary/51100/' " w:xpath="/ns0:NavWordReportXmlPart[1]/ns0:VendorScorecards" w:storeItemID="{DA5D4310-D13F-432C-84F0-FA8B9D237202}"/>
           <w15:repeatingSection/>
           <w:alias w:val="#Nav: /VendorScorecards"/>
@@ -916,7 +891,7 @@
         <w:sdtContent>
           <w:sdt>
             <w:sdtPr>
-              <w:id w:val="1851829754"/>
+              <w:id w:val="1336037016"/>
               <w:placeholder>
                 <w:docPart w:val="DefaultPlaceholder_-1854013435"/>
               </w:placeholder>
@@ -924,15 +899,9 @@
             </w:sdtPr>
             <w:sdtContent>
               <w:tr>
-                <w:tblPrEx>
-                  <w:tblCellMar>
-                    <w:top w:w="0" w:type="dxa"/>
-                    <w:bottom w:w="0" w:type="dxa"/>
-                  </w:tblCellMar>
-                </w:tblPrEx>
                 <w:sdt>
                   <w:sdtPr>
-                    <w:id w:val="-285584029"/>
+                    <w:id w:val="1445730572"/>
                     <w:placeholder>
                       <w:docPart w:val="DefaultPlaceholder_-1854013440"/>
                     </w:placeholder>
@@ -960,6 +929,9 @@
                         </w:tcMar>
                       </w:tcPr>
                       <w:p>
+                        <w:pPr>
+                          <w:jc w:val="both"/>
+                        </w:pPr>
                         <w:proofErr w:type="spellStart"/>
                         <w:r>
                           <w:t>VendorNo</w:t>
@@ -971,7 +943,7 @@
                 </w:sdt>
                 <w:sdt>
                   <w:sdtPr>
-                    <w:id w:val="-2017530677"/>
+                    <w:id w:val="-1534183631"/>
                     <w:placeholder>
                       <w:docPart w:val="DefaultPlaceholder_-1854013440"/>
                     </w:placeholder>
@@ -999,6 +971,9 @@
                         </w:tcMar>
                       </w:tcPr>
                       <w:p>
+                        <w:pPr>
+                          <w:jc w:val="both"/>
+                        </w:pPr>
                         <w:proofErr w:type="spellStart"/>
                         <w:r>
                           <w:t>AssessmentCount</w:t>
@@ -1010,13 +985,13 @@
                 </w:sdt>
                 <w:sdt>
                   <w:sdtPr>
-                    <w:id w:val="-518862677"/>
+                    <w:id w:val="547874181"/>
                     <w:placeholder>
                       <w:docPart w:val="DefaultPlaceholder_-1854013440"/>
                     </w:placeholder>
-                    <w:dataBinding w:prefixMappings="xmlns:ns0='urn:microsoft-dynamics-nav/reports/PCX_Purchase_Risk_Summary/51100/' " w:xpath="/ns0:NavWordReportXmlPart[1]/ns0:VendorScorecards[1]/ns0:OnTimePct[1]" w:storeItemID="{DA5D4310-D13F-432C-84F0-FA8B9D237202}"/>
+                    <w:dataBinding w:prefixMappings="xmlns:ns0='urn:microsoft-dynamics-nav/reports/PCX_Purchase_Risk_Summary/51100/' " w:xpath="/ns0:NavWordReportXmlPart[1]/ns0:VendorScorecards[1]/ns0:OnTimePctTxt[1]" w:storeItemID="{DA5D4310-D13F-432C-84F0-FA8B9D237202}"/>
                     <w:text/>
-                    <w:alias w:val="#Nav: /VendorScorecards/OnTimePct"/>
+                    <w:alias w:val="#Nav: /VendorScorecards/OnTimePctTxt"/>
                     <w:tag w:val="#Nav: PCX_Purchase_Risk_Summary/51100"/>
                   </w:sdtPr>
                   <w:sdtContent>
@@ -1038,9 +1013,12 @@
                         </w:tcMar>
                       </w:tcPr>
                       <w:p>
+                        <w:pPr>
+                          <w:jc w:val="both"/>
+                        </w:pPr>
                         <w:proofErr w:type="spellStart"/>
                         <w:r>
-                          <w:t>OnTimePct</w:t>
+                          <w:t>OnTimePctTxt</w:t>
                         </w:r>
                         <w:proofErr w:type="spellEnd"/>
                       </w:p>
@@ -1049,13 +1027,13 @@
                 </w:sdt>
                 <w:sdt>
                   <w:sdtPr>
-                    <w:id w:val="443359226"/>
+                    <w:id w:val="1545029321"/>
                     <w:placeholder>
                       <w:docPart w:val="DefaultPlaceholder_-1854013440"/>
                     </w:placeholder>
-                    <w:dataBinding w:prefixMappings="xmlns:ns0='urn:microsoft-dynamics-nav/reports/PCX_Purchase_Risk_Summary/51100/' " w:xpath="/ns0:NavWordReportXmlPart[1]/ns0:VendorScorecards[1]/ns0:QtyAccuracyPct[1]" w:storeItemID="{DA5D4310-D13F-432C-84F0-FA8B9D237202}"/>
+                    <w:dataBinding w:prefixMappings="xmlns:ns0='urn:microsoft-dynamics-nav/reports/PCX_Purchase_Risk_Summary/51100/' " w:xpath="/ns0:NavWordReportXmlPart[1]/ns0:VendorScorecards[1]/ns0:QtyAccuracyPctTxt[1]" w:storeItemID="{DA5D4310-D13F-432C-84F0-FA8B9D237202}"/>
                     <w:text/>
-                    <w:alias w:val="#Nav: /VendorScorecards/QtyAccuracyPct"/>
+                    <w:alias w:val="#Nav: /VendorScorecards/QtyAccuracyPctTxt"/>
                     <w:tag w:val="#Nav: PCX_Purchase_Risk_Summary/51100"/>
                   </w:sdtPr>
                   <w:sdtContent>
@@ -1077,9 +1055,12 @@
                         </w:tcMar>
                       </w:tcPr>
                       <w:p>
+                        <w:pPr>
+                          <w:jc w:val="both"/>
+                        </w:pPr>
                         <w:proofErr w:type="spellStart"/>
                         <w:r>
-                          <w:t>QtyAccuracyPct</w:t>
+                          <w:t>QtyAccuracyPctTxt</w:t>
                         </w:r>
                         <w:proofErr w:type="spellEnd"/>
                       </w:p>
@@ -1088,13 +1069,13 @@
                 </w:sdt>
                 <w:sdt>
                   <w:sdtPr>
-                    <w:id w:val="-1861194096"/>
+                    <w:id w:val="383538434"/>
                     <w:placeholder>
                       <w:docPart w:val="DefaultPlaceholder_-1854013440"/>
                     </w:placeholder>
-                    <w:dataBinding w:prefixMappings="xmlns:ns0='urn:microsoft-dynamics-nav/reports/PCX_Purchase_Risk_Summary/51100/' " w:xpath="/ns0:NavWordReportXmlPart[1]/ns0:VendorScorecards[1]/ns0:PriceAccuracyPct[1]" w:storeItemID="{DA5D4310-D13F-432C-84F0-FA8B9D237202}"/>
+                    <w:dataBinding w:prefixMappings="xmlns:ns0='urn:microsoft-dynamics-nav/reports/PCX_Purchase_Risk_Summary/51100/' " w:xpath="/ns0:NavWordReportXmlPart[1]/ns0:VendorScorecards[1]/ns0:PriceAccuracyPctTxt[1]" w:storeItemID="{DA5D4310-D13F-432C-84F0-FA8B9D237202}"/>
                     <w:text/>
-                    <w:alias w:val="#Nav: /VendorScorecards/PriceAccuracyPct"/>
+                    <w:alias w:val="#Nav: /VendorScorecards/PriceAccuracyPctTxt"/>
                     <w:tag w:val="#Nav: PCX_Purchase_Risk_Summary/51100"/>
                   </w:sdtPr>
                   <w:sdtContent>
@@ -1116,9 +1097,12 @@
                         </w:tcMar>
                       </w:tcPr>
                       <w:p>
+                        <w:pPr>
+                          <w:jc w:val="both"/>
+                        </w:pPr>
                         <w:proofErr w:type="spellStart"/>
                         <w:r>
-                          <w:t>PriceAccuracyPct</w:t>
+                          <w:t>PriceAccuracyPctTxt</w:t>
                         </w:r>
                         <w:proofErr w:type="spellEnd"/>
                       </w:p>
@@ -1127,13 +1111,13 @@
                 </w:sdt>
                 <w:sdt>
                   <w:sdtPr>
-                    <w:id w:val="-2093001580"/>
+                    <w:id w:val="388542618"/>
                     <w:placeholder>
                       <w:docPart w:val="DefaultPlaceholder_-1854013440"/>
                     </w:placeholder>
-                    <w:dataBinding w:prefixMappings="xmlns:ns0='urn:microsoft-dynamics-nav/reports/PCX_Purchase_Risk_Summary/51100/' " w:xpath="/ns0:NavWordReportXmlPart[1]/ns0:VendorScorecards[1]/ns0:OverallScore[1]" w:storeItemID="{DA5D4310-D13F-432C-84F0-FA8B9D237202}"/>
+                    <w:dataBinding w:prefixMappings="xmlns:ns0='urn:microsoft-dynamics-nav/reports/PCX_Purchase_Risk_Summary/51100/' " w:xpath="/ns0:NavWordReportXmlPart[1]/ns0:VendorScorecards[1]/ns0:OverallScoreTxt[1]" w:storeItemID="{DA5D4310-D13F-432C-84F0-FA8B9D237202}"/>
                     <w:text/>
-                    <w:alias w:val="#Nav: /VendorScorecards/OverallScore"/>
+                    <w:alias w:val="#Nav: /VendorScorecards/OverallScoreTxt"/>
                     <w:tag w:val="#Nav: PCX_Purchase_Risk_Summary/51100"/>
                   </w:sdtPr>
                   <w:sdtContent>
@@ -1155,9 +1139,12 @@
                         </w:tcMar>
                       </w:tcPr>
                       <w:p>
+                        <w:pPr>
+                          <w:jc w:val="both"/>
+                        </w:pPr>
                         <w:proofErr w:type="spellStart"/>
                         <w:r>
-                          <w:t>OverallScore</w:t>
+                          <w:t>OverallScoreTxt</w:t>
                         </w:r>
                         <w:proofErr w:type="spellEnd"/>
                       </w:p>
@@ -1166,7 +1153,7 @@
                 </w:sdt>
                 <w:sdt>
                   <w:sdtPr>
-                    <w:id w:val="1973550597"/>
+                    <w:id w:val="1046717593"/>
                     <w:placeholder>
                       <w:docPart w:val="DefaultPlaceholder_-1854013440"/>
                     </w:placeholder>
@@ -1194,6 +1181,9 @@
                         </w:tcMar>
                       </w:tcPr>
                       <w:p>
+                        <w:pPr>
+                          <w:jc w:val="both"/>
+                        </w:pPr>
                         <w:r>
                           <w:t>Rating</w:t>
                         </w:r>
@@ -1749,6 +1739,64 @@
         </w:p>
       </w:docPartBody>
     </w:docPart>
+    <w:docPart>
+      <w:docPartPr>
+        <w:name w:val="61B927D255664D2EA4B29BE6E2E2CDCB"/>
+        <w:category>
+          <w:name w:val="General"/>
+          <w:gallery w:val="placeholder"/>
+        </w:category>
+        <w:types>
+          <w:type w:val="bbPlcHdr"/>
+        </w:types>
+        <w:behaviors>
+          <w:behavior w:val="content"/>
+        </w:behaviors>
+        <w:guid w:val="{7B46E03D-37F3-4177-BA34-A9C51402F178}"/>
+      </w:docPartPr>
+      <w:docPartBody>
+        <w:p>
+          <w:pPr>
+            <w:pStyle w:val="61B927D255664D2EA4B29BE6E2E2CDCB"/>
+          </w:pPr>
+          <w:r>
+            <w:rPr>
+              <w:rStyle w:val="PlaceholderText"/>
+            </w:rPr>
+            <w:t>Enter any content that you want to repeat, including other content controls. You can also insert this control around table rows in order to repeat parts of a table.</w:t>
+          </w:r>
+        </w:p>
+      </w:docPartBody>
+    </w:docPart>
+    <w:docPart>
+      <w:docPartPr>
+        <w:name w:val="0580506ADACC4BB399022E5AEC4852A3"/>
+        <w:category>
+          <w:name w:val="General"/>
+          <w:gallery w:val="placeholder"/>
+        </w:category>
+        <w:types>
+          <w:type w:val="bbPlcHdr"/>
+        </w:types>
+        <w:behaviors>
+          <w:behavior w:val="content"/>
+        </w:behaviors>
+        <w:guid w:val="{B8F44D50-C356-4A92-A5CB-AE34F1FC56EB}"/>
+      </w:docPartPr>
+      <w:docPartBody>
+        <w:p>
+          <w:pPr>
+            <w:pStyle w:val="0580506ADACC4BB399022E5AEC4852A3"/>
+          </w:pPr>
+          <w:r>
+            <w:rPr>
+              <w:rStyle w:val="PlaceholderText"/>
+            </w:rPr>
+            <w:t>Click or tap here to enter text.</w:t>
+          </w:r>
+        </w:p>
+      </w:docPartBody>
+    </w:docPart>
   </w:docParts>
 </w:glossaryDocument>
 </file>
@@ -1797,8 +1845,14 @@
     <w:rsid w:val="001D079C"/>
     <w:rsid w:val="002B5273"/>
     <w:rsid w:val="003543DF"/>
+    <w:rsid w:val="004666C1"/>
+    <w:rsid w:val="00626902"/>
+    <w:rsid w:val="00631DC8"/>
     <w:rsid w:val="00823F98"/>
     <w:rsid w:val="00A11A1D"/>
+    <w:rsid w:val="00D221BD"/>
+    <w:rsid w:val="00E507A4"/>
+    <w:rsid w:val="00E96A68"/>
   </w:rsids>
   <m:mathPr>
     <m:mathFont m:val="Cambria Math"/>
@@ -2254,10 +2308,30 @@
     <w:basedOn w:val="DefaultParagraphFont"/>
     <w:uiPriority w:val="99"/>
     <w:semiHidden/>
-    <w:rsid w:val="00A11A1D"/>
+    <w:rsid w:val="004666C1"/>
     <w:rPr>
       <w:color w:val="666666"/>
     </w:rPr>
+  </w:style>
+  <w:style w:type="paragraph" w:customStyle="1" w:styleId="61B927D255664D2EA4B29BE6E2E2CDCB">
+    <w:name w:val="61B927D255664D2EA4B29BE6E2E2CDCB"/>
+    <w:rsid w:val="00E96A68"/>
+  </w:style>
+  <w:style w:type="paragraph" w:customStyle="1" w:styleId="0580506ADACC4BB399022E5AEC4852A3">
+    <w:name w:val="0580506ADACC4BB399022E5AEC4852A3"/>
+    <w:rsid w:val="00E96A68"/>
+  </w:style>
+  <w:style w:type="paragraph" w:customStyle="1" w:styleId="40CDF30DA88248F782898BF3EFDD791D">
+    <w:name w:val="40CDF30DA88248F782898BF3EFDD791D"/>
+    <w:rsid w:val="004666C1"/>
+  </w:style>
+  <w:style w:type="paragraph" w:customStyle="1" w:styleId="8407124660E04B049C7D7EE2F6799A61">
+    <w:name w:val="8407124660E04B049C7D7EE2F6799A61"/>
+    <w:rsid w:val="004666C1"/>
+  </w:style>
+  <w:style w:type="paragraph" w:customStyle="1" w:styleId="0D953F2E972B4B3BB69702258F1BEC3C">
+    <w:name w:val="0D953F2E972B4B3BB69702258F1BEC3C"/>
+    <w:rsid w:val="004666C1"/>
   </w:style>
 </w:styles>
 </file>
@@ -2750,12 +2824,6 @@
  
          < / T o o l t i p >   
-         < T o o l t i p   c o l u m n = " E x p e c t e d R e c e i p t D a t e "   E l e m e n t I d = " 1 9 8 8 0 4 6 2 0 5 " > - 
-             < T o o l t i p T e x t   l a n g = " e n - U S " > S p e c i f i e s   t h e   d a t e   y o u   e x p e c t   t h e   i t e m s   t o   b e   a v a i l a b l e   i n   y o u r   w a r e h o u s e .   I f   y o u   l e a v e   t h e   f i e l d   b l a n k ,   i t   w i l l   b e   c a l c u l a t e d   a s   f o l l o w s :   P l a n n e d   R e c e i p t   D a t e   +   S a f e t y   L e a d   T i m e   +   I n b o u n d   W a r e h o u s e   H a n d l i n g   T i m e   =   E x p e c t e d   R e c e i p t   D a t e . < / T o o l t i p T e x t > - 
-         < / T o o l t i p > - 
      < / T o o l t i p s >   
      < O p e n R i s k O r d e r s   E l e m e n t T y p e = " D a t a I t e m "   E l e m e n t I d = " 1 6 9 4 5 1 3 7 4 3 " > @@ -2766,8 +2834,6 @@
  
          < C u r r e n t l y O v e r d u e   E l e m e n t T y p e = " C o l u m n "   E l e m e n t I d = " 2 0 1 4 7 8 0 3 5 5 "   D a t a T y p e = " B o o l e a n " > C u r r e n t l y O v e r d u e < / C u r r e n t l y O v e r d u e >   
-         < E x p e c t e d R e c e i p t D a t e   E l e m e n t T y p e = " C o l u m n "   E l e m e n t I d = " 1 9 8 8 0 4 6 2 0 5 "   D a t a T y p e = " D a t e " > E x p e c t e d R e c e i p t D a t e < / E x p e c t e d R e c e i p t D a t e > - 
          < H e a d e r T e x t _   E l e m e n t T y p e = " C o l u m n "   E l e m e n t I d = " 4 7 7 0 5 2 0 7 2 "   D a t a T y p e = " T e x t " > H e a d e r T e x t _ < / H e a d e r T e x t _ >   
          < M a t c h S t a t u s   E l e m e n t T y p e = " C o l u m n "   E l e m e n t I d = " 1 7 2 7 1 1 8 1 0 6 "   D a t a T y p e = " E n u m " > M a t c h S t a t u s < / M a t c h S t a t u s > @@ -2782,13 +2848,13 @@
  
          < A s s e s s m e n t C o u n t   E l e m e n t T y p e = " C o l u m n "   E l e m e n t I d = " 5 9 8 6 7 8 3 6 0 "   D a t a T y p e = " I n t e g e r " > A s s e s s m e n t C o u n t < / A s s e s s m e n t C o u n t >   
-         < O n T i m e P c t   E l e m e n t T y p e = " C o l u m n "   E l e m e n t I d = " 1 6 7 2 6 1 5 3 1 4 "   D a t a T y p e = " D e c i m a l " > O n T i m e P c t < / O n T i m e P c t > - 
-         < O v e r a l l S c o r e   E l e m e n t T y p e = " C o l u m n "   E l e m e n t I d = " 1 2 6 6 1 0 0 0 5 8 "   D a t a T y p e = " D e c i m a l " > O v e r a l l S c o r e < / O v e r a l l S c o r e > - 
-         < P r i c e A c c u r a c y P c t   E l e m e n t T y p e = " C o l u m n "   E l e m e n t I d = " 1 9 3 3 1 6 4 9 2 6 "   D a t a T y p e = " D e c i m a l " > P r i c e A c c u r a c y P c t < / P r i c e A c c u r a c y P c t > - 
-         < Q t y A c c u r a c y P c t   E l e m e n t T y p e = " C o l u m n "   E l e m e n t I d = " 1 6 6 1 0 6 1 0 5 1 "   D a t a T y p e = " D e c i m a l " > Q t y A c c u r a c y P c t < / Q t y A c c u r a c y P c t > +         < O n T i m e P c t T x t   E l e m e n t T y p e = " C o l u m n "   E l e m e n t I d = " 9 5 6 1 4 8 1 2 2 "   D a t a T y p e = " T e x t " > O n T i m e P c t T x t < / O n T i m e P c t T x t > + 
+         < O v e r a l l S c o r e T x t   E l e m e n t T y p e = " C o l u m n "   E l e m e n t I d = " 1 7 2 3 4 1 3 5 2 2 "   D a t a T y p e = " T e x t " > O v e r a l l S c o r e T x t < / O v e r a l l S c o r e T x t > + 
+         < P r i c e A c c u r a c y P c t T x t   E l e m e n t T y p e = " C o l u m n "   E l e m e n t I d = " 1 1 0 2 0 8 8 9 1 8 "   D a t a T y p e = " T e x t " > P r i c e A c c u r a c y P c t T x t < / P r i c e A c c u r a c y P c t T x t > + 
+         < Q t y A c c u r a c y P c t T x t   E l e m e n t T y p e = " C o l u m n "   E l e m e n t I d = " 2 0 0 5 4 0 3 7 4 9 "   D a t a T y p e = " T e x t " > Q t y A c c u r a c y P c t T x t < / Q t y A c c u r a c y P c t T x t >   
          < R a t i n g   E l e m e n t T y p e = " C o l u m n "   E l e m e n t I d = " 5 4 1 9 8 6 2 9 8 "   D a t a T y p e = " E n u m " > R a t i n g < / R a t i n g >   
@@ -2953,8 +3019,6 @@
  
          < C u r r e n t l y O v e r d u e > C u r r e n t l y O v e r d u e < / C u r r e n t l y O v e r d u e >   
-         < E x p e c t e d R e c e i p t D a t e > E x p e c t e d R e c e i p t D a t e < / E x p e c t e d R e c e i p t D a t e > - 
          < H e a d e r T e x t _ > H e a d e r T e x t _ < / H e a d e r T e x t _ >   
          < M a t c h S t a t u s > M a t c h S t a t u s < / M a t c h S t a t u s > @@ -2969,13 +3033,13 @@
  
          < A s s e s s m e n t C o u n t > A s s e s s m e n t C o u n t < / A s s e s s m e n t C o u n t >   
-         < O n T i m e P c t > O n T i m e P c t < / O n T i m e P c t > - 
-         < O v e r a l l S c o r e > O v e r a l l S c o r e < / O v e r a l l S c o r e > - 
-         < P r i c e A c c u r a c y P c t > P r i c e A c c u r a c y P c t < / P r i c e A c c u r a c y P c t > - 
-         < Q t y A c c u r a c y P c t > Q t y A c c u r a c y P c t < / Q t y A c c u r a c y P c t > +         < O n T i m e P c t T x t > O n T i m e P c t T x t < / O n T i m e P c t T x t > + 
+         < O v e r a l l S c o r e T x t > O v e r a l l S c o r e T x t < / O v e r a l l S c o r e T x t > + 
+         < P r i c e A c c u r a c y P c t T x t > P r i c e A c c u r a c y P c t T x t < / P r i c e A c c u r a c y P c t T x t > + 
+         < Q t y A c c u r a c y P c t T x t > Q t y A c c u r a c y P c t T x t < / Q t y A c c u r a c y P c t T x t >   
          < R a t i n g > R a t i n g < / R a t i n g >   

</xml_diff>

<commit_message>
fix: left-align the cells of the summary report
</commit_message>
<xml_diff>
--- a/src/Reports/Layouts/PurchaseRiskSummary.docx
+++ b/src/Reports/Layouts/PurchaseRiskSummary.docx
@@ -97,12 +97,12 @@
       <w:tblPr>
         <w:tblW w:w="11666" w:type="dxa"/>
         <w:tblBorders>
-          <w:top w:val="single" w:color="auto" w:sz="4" w:space="0"/>
-          <w:left w:val="single" w:color="auto" w:sz="4" w:space="0"/>
-          <w:bottom w:val="single" w:color="auto" w:sz="4" w:space="0"/>
-          <w:right w:val="single" w:color="auto" w:sz="4" w:space="0"/>
-          <w:insideH w:val="single" w:color="auto" w:sz="4" w:space="0"/>
-          <w:insideV w:val="single" w:color="auto" w:sz="4" w:space="0"/>
+          <w:top w:val="single" w:sz="4" w:space="0" w:color="auto"/>
+          <w:left w:val="single" w:sz="4" w:space="0" w:color="auto"/>
+          <w:bottom w:val="single" w:sz="4" w:space="0" w:color="auto"/>
+          <w:right w:val="single" w:sz="4" w:space="0" w:color="auto"/>
+          <w:insideH w:val="single" w:sz="4" w:space="0" w:color="auto"/>
+          <w:insideV w:val="single" w:sz="4" w:space="0" w:color="auto"/>
         </w:tblBorders>
         <w:tblCellMar>
           <w:left w:w="10" w:type="dxa"/>
@@ -126,10 +126,10 @@
           <w:tcPr>
             <w:tcW w:w="1301" w:type="dxa"/>
             <w:tcBorders>
-              <w:top w:val="single" w:color="D9D9D9" w:sz="4" w:space="0"/>
-              <w:left w:val="single" w:color="D9D9D9" w:sz="4" w:space="0"/>
-              <w:bottom w:val="single" w:color="D9D9D9" w:sz="4" w:space="0"/>
-              <w:right w:val="single" w:color="D9D9D9" w:sz="4" w:space="0"/>
+              <w:top w:val="single" w:sz="4" w:space="0" w:color="D9D9D9"/>
+              <w:left w:val="single" w:sz="4" w:space="0" w:color="D9D9D9"/>
+              <w:bottom w:val="single" w:sz="4" w:space="0" w:color="D9D9D9"/>
+              <w:right w:val="single" w:sz="4" w:space="0" w:color="D9D9D9"/>
             </w:tcBorders>
             <w:shd w:val="clear" w:color="auto" w:fill="1F3864"/>
             <w:tcMar>
@@ -159,10 +159,10 @@
           <w:tcPr>
             <w:tcW w:w="2087" w:type="dxa"/>
             <w:tcBorders>
-              <w:top w:val="single" w:color="D9D9D9" w:sz="4" w:space="0"/>
-              <w:left w:val="single" w:color="D9D9D9" w:sz="4" w:space="0"/>
-              <w:bottom w:val="single" w:color="D9D9D9" w:sz="4" w:space="0"/>
-              <w:right w:val="single" w:color="D9D9D9" w:sz="4" w:space="0"/>
+              <w:top w:val="single" w:sz="4" w:space="0" w:color="D9D9D9"/>
+              <w:left w:val="single" w:sz="4" w:space="0" w:color="D9D9D9"/>
+              <w:bottom w:val="single" w:sz="4" w:space="0" w:color="D9D9D9"/>
+              <w:right w:val="single" w:sz="4" w:space="0" w:color="D9D9D9"/>
             </w:tcBorders>
             <w:shd w:val="clear" w:color="auto" w:fill="1F3864"/>
             <w:tcMar>
@@ -192,10 +192,10 @@
           <w:tcPr>
             <w:tcW w:w="2704" w:type="dxa"/>
             <w:tcBorders>
-              <w:top w:val="single" w:color="D9D9D9" w:sz="4" w:space="0"/>
-              <w:left w:val="single" w:color="D9D9D9" w:sz="4" w:space="0"/>
-              <w:bottom w:val="single" w:color="D9D9D9" w:sz="4" w:space="0"/>
-              <w:right w:val="single" w:color="D9D9D9" w:sz="4" w:space="0"/>
+              <w:top w:val="single" w:sz="4" w:space="0" w:color="D9D9D9"/>
+              <w:left w:val="single" w:sz="4" w:space="0" w:color="D9D9D9"/>
+              <w:bottom w:val="single" w:sz="4" w:space="0" w:color="D9D9D9"/>
+              <w:right w:val="single" w:sz="4" w:space="0" w:color="D9D9D9"/>
             </w:tcBorders>
             <w:shd w:val="clear" w:color="auto" w:fill="1F3864"/>
             <w:tcMar>
@@ -225,10 +225,10 @@
           <w:tcPr>
             <w:tcW w:w="1302" w:type="dxa"/>
             <w:tcBorders>
-              <w:top w:val="single" w:color="D9D9D9" w:sz="4" w:space="0"/>
-              <w:left w:val="single" w:color="D9D9D9" w:sz="4" w:space="0"/>
-              <w:bottom w:val="single" w:color="D9D9D9" w:sz="4" w:space="0"/>
-              <w:right w:val="single" w:color="D9D9D9" w:sz="4" w:space="0"/>
+              <w:top w:val="single" w:sz="4" w:space="0" w:color="D9D9D9"/>
+              <w:left w:val="single" w:sz="4" w:space="0" w:color="D9D9D9"/>
+              <w:bottom w:val="single" w:sz="4" w:space="0" w:color="D9D9D9"/>
+              <w:right w:val="single" w:sz="4" w:space="0" w:color="D9D9D9"/>
             </w:tcBorders>
             <w:shd w:val="clear" w:color="auto" w:fill="1F3864"/>
             <w:tcMar>
@@ -258,10 +258,10 @@
           <w:tcPr>
             <w:tcW w:w="2303" w:type="dxa"/>
             <w:tcBorders>
-              <w:top w:val="single" w:color="D9D9D9" w:sz="4" w:space="0"/>
-              <w:left w:val="single" w:color="D9D9D9" w:sz="4" w:space="0"/>
-              <w:bottom w:val="single" w:color="D9D9D9" w:sz="4" w:space="0"/>
-              <w:right w:val="single" w:color="D9D9D9" w:sz="4" w:space="0"/>
+              <w:top w:val="single" w:sz="4" w:space="0" w:color="D9D9D9"/>
+              <w:left w:val="single" w:sz="4" w:space="0" w:color="D9D9D9"/>
+              <w:bottom w:val="single" w:sz="4" w:space="0" w:color="D9D9D9"/>
+              <w:right w:val="single" w:sz="4" w:space="0" w:color="D9D9D9"/>
             </w:tcBorders>
             <w:shd w:val="clear" w:color="auto" w:fill="1F3864"/>
             <w:tcMar>
@@ -291,10 +291,10 @@
           <w:tcPr>
             <w:tcW w:w="1969" w:type="dxa"/>
             <w:tcBorders>
-              <w:top w:val="single" w:color="D9D9D9" w:sz="4" w:space="0"/>
-              <w:left w:val="single" w:color="D9D9D9" w:sz="4" w:space="0"/>
-              <w:bottom w:val="single" w:color="D9D9D9" w:sz="4" w:space="0"/>
-              <w:right w:val="single" w:color="D9D9D9" w:sz="4" w:space="0"/>
+              <w:top w:val="single" w:sz="4" w:space="0" w:color="D9D9D9"/>
+              <w:left w:val="single" w:sz="4" w:space="0" w:color="D9D9D9"/>
+              <w:bottom w:val="single" w:sz="4" w:space="0" w:color="D9D9D9"/>
+              <w:right w:val="single" w:sz="4" w:space="0" w:color="D9D9D9"/>
             </w:tcBorders>
             <w:shd w:val="clear" w:color="auto" w:fill="1F3864"/>
             <w:tcMar>
@@ -356,10 +356,10 @@
                       <w:tcPr>
                         <w:tcW w:w="1301" w:type="dxa"/>
                         <w:tcBorders>
-                          <w:top w:val="single" w:color="D9D9D9" w:sz="4" w:space="0"/>
-                          <w:left w:val="single" w:color="D9D9D9" w:sz="4" w:space="0"/>
-                          <w:bottom w:val="single" w:color="D9D9D9" w:sz="4" w:space="0"/>
-                          <w:right w:val="single" w:color="D9D9D9" w:sz="4" w:space="0"/>
+                          <w:top w:val="single" w:sz="4" w:space="0" w:color="D9D9D9"/>
+                          <w:left w:val="single" w:sz="4" w:space="0" w:color="D9D9D9"/>
+                          <w:bottom w:val="single" w:sz="4" w:space="0" w:color="D9D9D9"/>
+                          <w:right w:val="single" w:sz="4" w:space="0" w:color="D9D9D9"/>
                         </w:tcBorders>
                         <w:shd w:val="clear" w:color="auto" w:fill="FFFFFF"/>
                         <w:tcMar>
@@ -370,9 +370,6 @@
                         </w:tcMar>
                       </w:tcPr>
                       <w:p>
-                        <w:pPr>
-                          <w:jc w:val="both"/>
-                        </w:pPr>
                         <w:r>
                           <w:t>No_</w:t>
                         </w:r>
@@ -396,10 +393,10 @@
                       <w:tcPr>
                         <w:tcW w:w="2087" w:type="dxa"/>
                         <w:tcBorders>
-                          <w:top w:val="single" w:color="D9D9D9" w:sz="4" w:space="0"/>
-                          <w:left w:val="single" w:color="D9D9D9" w:sz="4" w:space="0"/>
-                          <w:bottom w:val="single" w:color="D9D9D9" w:sz="4" w:space="0"/>
-                          <w:right w:val="single" w:color="D9D9D9" w:sz="4" w:space="0"/>
+                          <w:top w:val="single" w:sz="4" w:space="0" w:color="D9D9D9"/>
+                          <w:left w:val="single" w:sz="4" w:space="0" w:color="D9D9D9"/>
+                          <w:bottom w:val="single" w:sz="4" w:space="0" w:color="D9D9D9"/>
+                          <w:right w:val="single" w:sz="4" w:space="0" w:color="D9D9D9"/>
                         </w:tcBorders>
                         <w:shd w:val="clear" w:color="auto" w:fill="FFFFFF"/>
                         <w:tcMar>
@@ -410,9 +407,6 @@
                         </w:tcMar>
                       </w:tcPr>
                       <w:p>
-                        <w:pPr>
-                          <w:jc w:val="both"/>
-                        </w:pPr>
                         <w:proofErr w:type="spellStart"/>
                         <w:r>
                           <w:t>BuyFromVendorNo</w:t>
@@ -438,10 +432,10 @@
                       <w:tcPr>
                         <w:tcW w:w="2704" w:type="dxa"/>
                         <w:tcBorders>
-                          <w:top w:val="single" w:color="D9D9D9" w:sz="4" w:space="0"/>
-                          <w:left w:val="single" w:color="D9D9D9" w:sz="4" w:space="0"/>
-                          <w:bottom w:val="single" w:color="D9D9D9" w:sz="4" w:space="0"/>
-                          <w:right w:val="single" w:color="D9D9D9" w:sz="4" w:space="0"/>
+                          <w:top w:val="single" w:sz="4" w:space="0" w:color="D9D9D9"/>
+                          <w:left w:val="single" w:sz="4" w:space="0" w:color="D9D9D9"/>
+                          <w:bottom w:val="single" w:sz="4" w:space="0" w:color="D9D9D9"/>
+                          <w:right w:val="single" w:sz="4" w:space="0" w:color="D9D9D9"/>
                         </w:tcBorders>
                         <w:shd w:val="clear" w:color="auto" w:fill="FFFFFF"/>
                         <w:tcMar>
@@ -452,9 +446,6 @@
                         </w:tcMar>
                       </w:tcPr>
                       <w:p>
-                        <w:pPr>
-                          <w:jc w:val="both"/>
-                        </w:pPr>
                         <w:proofErr w:type="spellStart"/>
                         <w:r>
                           <w:t>BuyFromVendorName</w:t>
@@ -480,10 +471,10 @@
                       <w:tcPr>
                         <w:tcW w:w="1302" w:type="dxa"/>
                         <w:tcBorders>
-                          <w:top w:val="single" w:color="D9D9D9" w:sz="4" w:space="0"/>
-                          <w:left w:val="single" w:color="D9D9D9" w:sz="4" w:space="0"/>
-                          <w:bottom w:val="single" w:color="D9D9D9" w:sz="4" w:space="0"/>
-                          <w:right w:val="single" w:color="D9D9D9" w:sz="4" w:space="0"/>
+                          <w:top w:val="single" w:sz="4" w:space="0" w:color="D9D9D9"/>
+                          <w:left w:val="single" w:sz="4" w:space="0" w:color="D9D9D9"/>
+                          <w:bottom w:val="single" w:sz="4" w:space="0" w:color="D9D9D9"/>
+                          <w:right w:val="single" w:sz="4" w:space="0" w:color="D9D9D9"/>
                         </w:tcBorders>
                         <w:shd w:val="clear" w:color="auto" w:fill="FFFFFF"/>
                         <w:tcMar>
@@ -494,9 +485,6 @@
                         </w:tcMar>
                       </w:tcPr>
                       <w:p>
-                        <w:pPr>
-                          <w:jc w:val="both"/>
-                        </w:pPr>
                         <w:proofErr w:type="spellStart"/>
                         <w:r>
                           <w:t>RiskLevel</w:t>
@@ -522,10 +510,10 @@
                       <w:tcPr>
                         <w:tcW w:w="2303" w:type="dxa"/>
                         <w:tcBorders>
-                          <w:top w:val="single" w:color="D9D9D9" w:sz="4" w:space="0"/>
-                          <w:left w:val="single" w:color="D9D9D9" w:sz="4" w:space="0"/>
-                          <w:bottom w:val="single" w:color="D9D9D9" w:sz="4" w:space="0"/>
-                          <w:right w:val="single" w:color="D9D9D9" w:sz="4" w:space="0"/>
+                          <w:top w:val="single" w:sz="4" w:space="0" w:color="D9D9D9"/>
+                          <w:left w:val="single" w:sz="4" w:space="0" w:color="D9D9D9"/>
+                          <w:bottom w:val="single" w:sz="4" w:space="0" w:color="D9D9D9"/>
+                          <w:right w:val="single" w:sz="4" w:space="0" w:color="D9D9D9"/>
                         </w:tcBorders>
                         <w:shd w:val="clear" w:color="auto" w:fill="FFFFFF"/>
                         <w:tcMar>
@@ -536,9 +524,6 @@
                         </w:tcMar>
                       </w:tcPr>
                       <w:p>
-                        <w:pPr>
-                          <w:jc w:val="both"/>
-                        </w:pPr>
                         <w:proofErr w:type="spellStart"/>
                         <w:r>
                           <w:t>MatchStatus</w:t>
@@ -564,10 +549,10 @@
                       <w:tcPr>
                         <w:tcW w:w="1969" w:type="dxa"/>
                         <w:tcBorders>
-                          <w:top w:val="single" w:color="D9D9D9" w:sz="4" w:space="0"/>
-                          <w:left w:val="single" w:color="D9D9D9" w:sz="4" w:space="0"/>
-                          <w:bottom w:val="single" w:color="D9D9D9" w:sz="4" w:space="0"/>
-                          <w:right w:val="single" w:color="D9D9D9" w:sz="4" w:space="0"/>
+                          <w:top w:val="single" w:sz="4" w:space="0" w:color="D9D9D9"/>
+                          <w:left w:val="single" w:sz="4" w:space="0" w:color="D9D9D9"/>
+                          <w:bottom w:val="single" w:sz="4" w:space="0" w:color="D9D9D9"/>
+                          <w:right w:val="single" w:sz="4" w:space="0" w:color="D9D9D9"/>
                         </w:tcBorders>
                         <w:shd w:val="clear" w:color="auto" w:fill="FFFFFF"/>
                         <w:tcMar>
@@ -578,9 +563,6 @@
                         </w:tcMar>
                       </w:tcPr>
                       <w:p>
-                        <w:pPr>
-                          <w:jc w:val="both"/>
-                        </w:pPr>
                         <w:proofErr w:type="spellStart"/>
                         <w:r>
                           <w:t>CurrentlyOverdue</w:t>
@@ -622,12 +604,12 @@
       <w:tblPr>
         <w:tblW w:w="14040" w:type="dxa"/>
         <w:tblBorders>
-          <w:top w:val="single" w:color="auto" w:sz="4" w:space="0"/>
-          <w:left w:val="single" w:color="auto" w:sz="4" w:space="0"/>
-          <w:bottom w:val="single" w:color="auto" w:sz="4" w:space="0"/>
-          <w:right w:val="single" w:color="auto" w:sz="4" w:space="0"/>
-          <w:insideH w:val="single" w:color="auto" w:sz="4" w:space="0"/>
-          <w:insideV w:val="single" w:color="auto" w:sz="4" w:space="0"/>
+          <w:top w:val="single" w:sz="4" w:space="0" w:color="auto"/>
+          <w:left w:val="single" w:sz="4" w:space="0" w:color="auto"/>
+          <w:bottom w:val="single" w:sz="4" w:space="0" w:color="auto"/>
+          <w:right w:val="single" w:sz="4" w:space="0" w:color="auto"/>
+          <w:insideH w:val="single" w:sz="4" w:space="0" w:color="auto"/>
+          <w:insideV w:val="single" w:sz="4" w:space="0" w:color="auto"/>
         </w:tblBorders>
         <w:tblCellMar>
           <w:left w:w="10" w:type="dxa"/>
@@ -652,10 +634,10 @@
           <w:tcPr>
             <w:tcW w:w="1500" w:type="dxa"/>
             <w:tcBorders>
-              <w:top w:val="single" w:color="D9D9D9" w:sz="4" w:space="0"/>
-              <w:left w:val="single" w:color="D9D9D9" w:sz="4" w:space="0"/>
-              <w:bottom w:val="single" w:color="D9D9D9" w:sz="4" w:space="0"/>
-              <w:right w:val="single" w:color="D9D9D9" w:sz="4" w:space="0"/>
+              <w:top w:val="single" w:sz="4" w:space="0" w:color="D9D9D9"/>
+              <w:left w:val="single" w:sz="4" w:space="0" w:color="D9D9D9"/>
+              <w:bottom w:val="single" w:sz="4" w:space="0" w:color="D9D9D9"/>
+              <w:right w:val="single" w:sz="4" w:space="0" w:color="D9D9D9"/>
             </w:tcBorders>
             <w:shd w:val="clear" w:color="auto" w:fill="1F3864"/>
             <w:tcMar>
@@ -685,10 +667,10 @@
           <w:tcPr>
             <w:tcW w:w="1500" w:type="dxa"/>
             <w:tcBorders>
-              <w:top w:val="single" w:color="D9D9D9" w:sz="4" w:space="0"/>
-              <w:left w:val="single" w:color="D9D9D9" w:sz="4" w:space="0"/>
-              <w:bottom w:val="single" w:color="D9D9D9" w:sz="4" w:space="0"/>
-              <w:right w:val="single" w:color="D9D9D9" w:sz="4" w:space="0"/>
+              <w:top w:val="single" w:sz="4" w:space="0" w:color="D9D9D9"/>
+              <w:left w:val="single" w:sz="4" w:space="0" w:color="D9D9D9"/>
+              <w:bottom w:val="single" w:sz="4" w:space="0" w:color="D9D9D9"/>
+              <w:right w:val="single" w:sz="4" w:space="0" w:color="D9D9D9"/>
             </w:tcBorders>
             <w:shd w:val="clear" w:color="auto" w:fill="1F3864"/>
             <w:tcMar>
@@ -718,10 +700,10 @@
           <w:tcPr>
             <w:tcW w:w="1500" w:type="dxa"/>
             <w:tcBorders>
-              <w:top w:val="single" w:color="D9D9D9" w:sz="4" w:space="0"/>
-              <w:left w:val="single" w:color="D9D9D9" w:sz="4" w:space="0"/>
-              <w:bottom w:val="single" w:color="D9D9D9" w:sz="4" w:space="0"/>
-              <w:right w:val="single" w:color="D9D9D9" w:sz="4" w:space="0"/>
+              <w:top w:val="single" w:sz="4" w:space="0" w:color="D9D9D9"/>
+              <w:left w:val="single" w:sz="4" w:space="0" w:color="D9D9D9"/>
+              <w:bottom w:val="single" w:sz="4" w:space="0" w:color="D9D9D9"/>
+              <w:right w:val="single" w:sz="4" w:space="0" w:color="D9D9D9"/>
             </w:tcBorders>
             <w:shd w:val="clear" w:color="auto" w:fill="1F3864"/>
             <w:tcMar>
@@ -751,10 +733,10 @@
           <w:tcPr>
             <w:tcW w:w="1700" w:type="dxa"/>
             <w:tcBorders>
-              <w:top w:val="single" w:color="D9D9D9" w:sz="4" w:space="0"/>
-              <w:left w:val="single" w:color="D9D9D9" w:sz="4" w:space="0"/>
-              <w:bottom w:val="single" w:color="D9D9D9" w:sz="4" w:space="0"/>
-              <w:right w:val="single" w:color="D9D9D9" w:sz="4" w:space="0"/>
+              <w:top w:val="single" w:sz="4" w:space="0" w:color="D9D9D9"/>
+              <w:left w:val="single" w:sz="4" w:space="0" w:color="D9D9D9"/>
+              <w:bottom w:val="single" w:sz="4" w:space="0" w:color="D9D9D9"/>
+              <w:right w:val="single" w:sz="4" w:space="0" w:color="D9D9D9"/>
             </w:tcBorders>
             <w:shd w:val="clear" w:color="auto" w:fill="1F3864"/>
             <w:tcMar>
@@ -784,10 +766,10 @@
           <w:tcPr>
             <w:tcW w:w="1700" w:type="dxa"/>
             <w:tcBorders>
-              <w:top w:val="single" w:color="D9D9D9" w:sz="4" w:space="0"/>
-              <w:left w:val="single" w:color="D9D9D9" w:sz="4" w:space="0"/>
-              <w:bottom w:val="single" w:color="D9D9D9" w:sz="4" w:space="0"/>
-              <w:right w:val="single" w:color="D9D9D9" w:sz="4" w:space="0"/>
+              <w:top w:val="single" w:sz="4" w:space="0" w:color="D9D9D9"/>
+              <w:left w:val="single" w:sz="4" w:space="0" w:color="D9D9D9"/>
+              <w:bottom w:val="single" w:sz="4" w:space="0" w:color="D9D9D9"/>
+              <w:right w:val="single" w:sz="4" w:space="0" w:color="D9D9D9"/>
             </w:tcBorders>
             <w:shd w:val="clear" w:color="auto" w:fill="1F3864"/>
             <w:tcMar>
@@ -817,10 +799,10 @@
           <w:tcPr>
             <w:tcW w:w="1700" w:type="dxa"/>
             <w:tcBorders>
-              <w:top w:val="single" w:color="D9D9D9" w:sz="4" w:space="0"/>
-              <w:left w:val="single" w:color="D9D9D9" w:sz="4" w:space="0"/>
-              <w:bottom w:val="single" w:color="D9D9D9" w:sz="4" w:space="0"/>
-              <w:right w:val="single" w:color="D9D9D9" w:sz="4" w:space="0"/>
+              <w:top w:val="single" w:sz="4" w:space="0" w:color="D9D9D9"/>
+              <w:left w:val="single" w:sz="4" w:space="0" w:color="D9D9D9"/>
+              <w:bottom w:val="single" w:sz="4" w:space="0" w:color="D9D9D9"/>
+              <w:right w:val="single" w:sz="4" w:space="0" w:color="D9D9D9"/>
             </w:tcBorders>
             <w:shd w:val="clear" w:color="auto" w:fill="1F3864"/>
             <w:tcMar>
@@ -850,10 +832,10 @@
           <w:tcPr>
             <w:tcW w:w="1800" w:type="dxa"/>
             <w:tcBorders>
-              <w:top w:val="single" w:color="D9D9D9" w:sz="4" w:space="0"/>
-              <w:left w:val="single" w:color="D9D9D9" w:sz="4" w:space="0"/>
-              <w:bottom w:val="single" w:color="D9D9D9" w:sz="4" w:space="0"/>
-              <w:right w:val="single" w:color="D9D9D9" w:sz="4" w:space="0"/>
+              <w:top w:val="single" w:sz="4" w:space="0" w:color="D9D9D9"/>
+              <w:left w:val="single" w:sz="4" w:space="0" w:color="D9D9D9"/>
+              <w:bottom w:val="single" w:sz="4" w:space="0" w:color="D9D9D9"/>
+              <w:right w:val="single" w:sz="4" w:space="0" w:color="D9D9D9"/>
             </w:tcBorders>
             <w:shd w:val="clear" w:color="auto" w:fill="1F3864"/>
             <w:tcMar>
@@ -882,11 +864,11 @@
       </w:tr>
       <w:sdt>
         <w:sdtPr>
+          <w:alias w:val="#Nav: /VendorScorecards"/>
+          <w:tag w:val="#Nav: PCX_Purchase_Risk_Summary/51100"/>
           <w:id w:val="-1811465031"/>
           <w15:dataBinding w:prefixMappings="xmlns:ns0='urn:microsoft-dynamics-nav/reports/PCX_Purchase_Risk_Summary/51100/' " w:xpath="/ns0:NavWordReportXmlPart[1]/ns0:VendorScorecards" w:storeItemID="{DA5D4310-D13F-432C-84F0-FA8B9D237202}"/>
           <w15:repeatingSection/>
-          <w:alias w:val="#Nav: /VendorScorecards"/>
-          <w:tag w:val="#Nav: PCX_Purchase_Risk_Summary/51100"/>
         </w:sdtPr>
         <w:sdtContent>
           <w:sdt>
@@ -901,24 +883,24 @@
               <w:tr>
                 <w:sdt>
                   <w:sdtPr>
+                    <w:alias w:val="#Nav: /VendorScorecards/VendorNo"/>
+                    <w:tag w:val="#Nav: PCX_Purchase_Risk_Summary/51100"/>
                     <w:id w:val="1445730572"/>
                     <w:placeholder>
                       <w:docPart w:val="DefaultPlaceholder_-1854013440"/>
                     </w:placeholder>
                     <w:dataBinding w:prefixMappings="xmlns:ns0='urn:microsoft-dynamics-nav/reports/PCX_Purchase_Risk_Summary/51100/' " w:xpath="/ns0:NavWordReportXmlPart[1]/ns0:VendorScorecards[1]/ns0:VendorNo[1]" w:storeItemID="{DA5D4310-D13F-432C-84F0-FA8B9D237202}"/>
                     <w:text/>
-                    <w:alias w:val="#Nav: /VendorScorecards/VendorNo"/>
-                    <w:tag w:val="#Nav: PCX_Purchase_Risk_Summary/51100"/>
                   </w:sdtPr>
                   <w:sdtContent>
                     <w:tc>
                       <w:tcPr>
                         <w:tcW w:w="1500" w:type="dxa"/>
                         <w:tcBorders>
-                          <w:top w:val="single" w:color="D9D9D9" w:sz="4" w:space="0"/>
-                          <w:left w:val="single" w:color="D9D9D9" w:sz="4" w:space="0"/>
-                          <w:bottom w:val="single" w:color="D9D9D9" w:sz="4" w:space="0"/>
-                          <w:right w:val="single" w:color="D9D9D9" w:sz="4" w:space="0"/>
+                          <w:top w:val="single" w:sz="4" w:space="0" w:color="D9D9D9"/>
+                          <w:left w:val="single" w:sz="4" w:space="0" w:color="D9D9D9"/>
+                          <w:bottom w:val="single" w:sz="4" w:space="0" w:color="D9D9D9"/>
+                          <w:right w:val="single" w:sz="4" w:space="0" w:color="D9D9D9"/>
                         </w:tcBorders>
                         <w:shd w:val="clear" w:color="auto" w:fill="FFFFFF"/>
                         <w:tcMar>
@@ -929,9 +911,6 @@
                         </w:tcMar>
                       </w:tcPr>
                       <w:p>
-                        <w:pPr>
-                          <w:jc w:val="both"/>
-                        </w:pPr>
                         <w:proofErr w:type="spellStart"/>
                         <w:r>
                           <w:t>VendorNo</w:t>
@@ -943,24 +922,24 @@
                 </w:sdt>
                 <w:sdt>
                   <w:sdtPr>
+                    <w:alias w:val="#Nav: /VendorScorecards/AssessmentCount"/>
+                    <w:tag w:val="#Nav: PCX_Purchase_Risk_Summary/51100"/>
                     <w:id w:val="-1534183631"/>
                     <w:placeholder>
                       <w:docPart w:val="DefaultPlaceholder_-1854013440"/>
                     </w:placeholder>
                     <w:dataBinding w:prefixMappings="xmlns:ns0='urn:microsoft-dynamics-nav/reports/PCX_Purchase_Risk_Summary/51100/' " w:xpath="/ns0:NavWordReportXmlPart[1]/ns0:VendorScorecards[1]/ns0:AssessmentCount[1]" w:storeItemID="{DA5D4310-D13F-432C-84F0-FA8B9D237202}"/>
                     <w:text/>
-                    <w:alias w:val="#Nav: /VendorScorecards/AssessmentCount"/>
-                    <w:tag w:val="#Nav: PCX_Purchase_Risk_Summary/51100"/>
                   </w:sdtPr>
                   <w:sdtContent>
                     <w:tc>
                       <w:tcPr>
                         <w:tcW w:w="1500" w:type="dxa"/>
                         <w:tcBorders>
-                          <w:top w:val="single" w:color="D9D9D9" w:sz="4" w:space="0"/>
-                          <w:left w:val="single" w:color="D9D9D9" w:sz="4" w:space="0"/>
-                          <w:bottom w:val="single" w:color="D9D9D9" w:sz="4" w:space="0"/>
-                          <w:right w:val="single" w:color="D9D9D9" w:sz="4" w:space="0"/>
+                          <w:top w:val="single" w:sz="4" w:space="0" w:color="D9D9D9"/>
+                          <w:left w:val="single" w:sz="4" w:space="0" w:color="D9D9D9"/>
+                          <w:bottom w:val="single" w:sz="4" w:space="0" w:color="D9D9D9"/>
+                          <w:right w:val="single" w:sz="4" w:space="0" w:color="D9D9D9"/>
                         </w:tcBorders>
                         <w:shd w:val="clear" w:color="auto" w:fill="FFFFFF"/>
                         <w:tcMar>
@@ -971,9 +950,6 @@
                         </w:tcMar>
                       </w:tcPr>
                       <w:p>
-                        <w:pPr>
-                          <w:jc w:val="both"/>
-                        </w:pPr>
                         <w:proofErr w:type="spellStart"/>
                         <w:r>
                           <w:t>AssessmentCount</w:t>
@@ -985,24 +961,24 @@
                 </w:sdt>
                 <w:sdt>
                   <w:sdtPr>
+                    <w:alias w:val="#Nav: /VendorScorecards/OnTimePctTxt"/>
+                    <w:tag w:val="#Nav: PCX_Purchase_Risk_Summary/51100"/>
                     <w:id w:val="547874181"/>
                     <w:placeholder>
                       <w:docPart w:val="DefaultPlaceholder_-1854013440"/>
                     </w:placeholder>
                     <w:dataBinding w:prefixMappings="xmlns:ns0='urn:microsoft-dynamics-nav/reports/PCX_Purchase_Risk_Summary/51100/' " w:xpath="/ns0:NavWordReportXmlPart[1]/ns0:VendorScorecards[1]/ns0:OnTimePctTxt[1]" w:storeItemID="{DA5D4310-D13F-432C-84F0-FA8B9D237202}"/>
                     <w:text/>
-                    <w:alias w:val="#Nav: /VendorScorecards/OnTimePctTxt"/>
-                    <w:tag w:val="#Nav: PCX_Purchase_Risk_Summary/51100"/>
                   </w:sdtPr>
                   <w:sdtContent>
                     <w:tc>
                       <w:tcPr>
                         <w:tcW w:w="1500" w:type="dxa"/>
                         <w:tcBorders>
-                          <w:top w:val="single" w:color="D9D9D9" w:sz="4" w:space="0"/>
-                          <w:left w:val="single" w:color="D9D9D9" w:sz="4" w:space="0"/>
-                          <w:bottom w:val="single" w:color="D9D9D9" w:sz="4" w:space="0"/>
-                          <w:right w:val="single" w:color="D9D9D9" w:sz="4" w:space="0"/>
+                          <w:top w:val="single" w:sz="4" w:space="0" w:color="D9D9D9"/>
+                          <w:left w:val="single" w:sz="4" w:space="0" w:color="D9D9D9"/>
+                          <w:bottom w:val="single" w:sz="4" w:space="0" w:color="D9D9D9"/>
+                          <w:right w:val="single" w:sz="4" w:space="0" w:color="D9D9D9"/>
                         </w:tcBorders>
                         <w:shd w:val="clear" w:color="auto" w:fill="FFFFFF"/>
                         <w:tcMar>
@@ -1013,9 +989,6 @@
                         </w:tcMar>
                       </w:tcPr>
                       <w:p>
-                        <w:pPr>
-                          <w:jc w:val="both"/>
-                        </w:pPr>
                         <w:proofErr w:type="spellStart"/>
                         <w:r>
                           <w:t>OnTimePctTxt</w:t>
@@ -1027,24 +1000,24 @@
                 </w:sdt>
                 <w:sdt>
                   <w:sdtPr>
+                    <w:alias w:val="#Nav: /VendorScorecards/QtyAccuracyPctTxt"/>
+                    <w:tag w:val="#Nav: PCX_Purchase_Risk_Summary/51100"/>
                     <w:id w:val="1545029321"/>
                     <w:placeholder>
                       <w:docPart w:val="DefaultPlaceholder_-1854013440"/>
                     </w:placeholder>
                     <w:dataBinding w:prefixMappings="xmlns:ns0='urn:microsoft-dynamics-nav/reports/PCX_Purchase_Risk_Summary/51100/' " w:xpath="/ns0:NavWordReportXmlPart[1]/ns0:VendorScorecards[1]/ns0:QtyAccuracyPctTxt[1]" w:storeItemID="{DA5D4310-D13F-432C-84F0-FA8B9D237202}"/>
                     <w:text/>
-                    <w:alias w:val="#Nav: /VendorScorecards/QtyAccuracyPctTxt"/>
-                    <w:tag w:val="#Nav: PCX_Purchase_Risk_Summary/51100"/>
                   </w:sdtPr>
                   <w:sdtContent>
                     <w:tc>
                       <w:tcPr>
                         <w:tcW w:w="1700" w:type="dxa"/>
                         <w:tcBorders>
-                          <w:top w:val="single" w:color="D9D9D9" w:sz="4" w:space="0"/>
-                          <w:left w:val="single" w:color="D9D9D9" w:sz="4" w:space="0"/>
-                          <w:bottom w:val="single" w:color="D9D9D9" w:sz="4" w:space="0"/>
-                          <w:right w:val="single" w:color="D9D9D9" w:sz="4" w:space="0"/>
+                          <w:top w:val="single" w:sz="4" w:space="0" w:color="D9D9D9"/>
+                          <w:left w:val="single" w:sz="4" w:space="0" w:color="D9D9D9"/>
+                          <w:bottom w:val="single" w:sz="4" w:space="0" w:color="D9D9D9"/>
+                          <w:right w:val="single" w:sz="4" w:space="0" w:color="D9D9D9"/>
                         </w:tcBorders>
                         <w:shd w:val="clear" w:color="auto" w:fill="FFFFFF"/>
                         <w:tcMar>
@@ -1055,9 +1028,6 @@
                         </w:tcMar>
                       </w:tcPr>
                       <w:p>
-                        <w:pPr>
-                          <w:jc w:val="both"/>
-                        </w:pPr>
                         <w:proofErr w:type="spellStart"/>
                         <w:r>
                           <w:t>QtyAccuracyPctTxt</w:t>
@@ -1069,24 +1039,24 @@
                 </w:sdt>
                 <w:sdt>
                   <w:sdtPr>
+                    <w:alias w:val="#Nav: /VendorScorecards/PriceAccuracyPctTxt"/>
+                    <w:tag w:val="#Nav: PCX_Purchase_Risk_Summary/51100"/>
                     <w:id w:val="383538434"/>
                     <w:placeholder>
                       <w:docPart w:val="DefaultPlaceholder_-1854013440"/>
                     </w:placeholder>
                     <w:dataBinding w:prefixMappings="xmlns:ns0='urn:microsoft-dynamics-nav/reports/PCX_Purchase_Risk_Summary/51100/' " w:xpath="/ns0:NavWordReportXmlPart[1]/ns0:VendorScorecards[1]/ns0:PriceAccuracyPctTxt[1]" w:storeItemID="{DA5D4310-D13F-432C-84F0-FA8B9D237202}"/>
                     <w:text/>
-                    <w:alias w:val="#Nav: /VendorScorecards/PriceAccuracyPctTxt"/>
-                    <w:tag w:val="#Nav: PCX_Purchase_Risk_Summary/51100"/>
                   </w:sdtPr>
                   <w:sdtContent>
                     <w:tc>
                       <w:tcPr>
                         <w:tcW w:w="1700" w:type="dxa"/>
                         <w:tcBorders>
-                          <w:top w:val="single" w:color="D9D9D9" w:sz="4" w:space="0"/>
-                          <w:left w:val="single" w:color="D9D9D9" w:sz="4" w:space="0"/>
-                          <w:bottom w:val="single" w:color="D9D9D9" w:sz="4" w:space="0"/>
-                          <w:right w:val="single" w:color="D9D9D9" w:sz="4" w:space="0"/>
+                          <w:top w:val="single" w:sz="4" w:space="0" w:color="D9D9D9"/>
+                          <w:left w:val="single" w:sz="4" w:space="0" w:color="D9D9D9"/>
+                          <w:bottom w:val="single" w:sz="4" w:space="0" w:color="D9D9D9"/>
+                          <w:right w:val="single" w:sz="4" w:space="0" w:color="D9D9D9"/>
                         </w:tcBorders>
                         <w:shd w:val="clear" w:color="auto" w:fill="FFFFFF"/>
                         <w:tcMar>
@@ -1097,9 +1067,6 @@
                         </w:tcMar>
                       </w:tcPr>
                       <w:p>
-                        <w:pPr>
-                          <w:jc w:val="both"/>
-                        </w:pPr>
                         <w:proofErr w:type="spellStart"/>
                         <w:r>
                           <w:t>PriceAccuracyPctTxt</w:t>
@@ -1111,24 +1078,24 @@
                 </w:sdt>
                 <w:sdt>
                   <w:sdtPr>
+                    <w:alias w:val="#Nav: /VendorScorecards/OverallScoreTxt"/>
+                    <w:tag w:val="#Nav: PCX_Purchase_Risk_Summary/51100"/>
                     <w:id w:val="388542618"/>
                     <w:placeholder>
                       <w:docPart w:val="DefaultPlaceholder_-1854013440"/>
                     </w:placeholder>
                     <w:dataBinding w:prefixMappings="xmlns:ns0='urn:microsoft-dynamics-nav/reports/PCX_Purchase_Risk_Summary/51100/' " w:xpath="/ns0:NavWordReportXmlPart[1]/ns0:VendorScorecards[1]/ns0:OverallScoreTxt[1]" w:storeItemID="{DA5D4310-D13F-432C-84F0-FA8B9D237202}"/>
                     <w:text/>
-                    <w:alias w:val="#Nav: /VendorScorecards/OverallScoreTxt"/>
-                    <w:tag w:val="#Nav: PCX_Purchase_Risk_Summary/51100"/>
                   </w:sdtPr>
                   <w:sdtContent>
                     <w:tc>
                       <w:tcPr>
                         <w:tcW w:w="1700" w:type="dxa"/>
                         <w:tcBorders>
-                          <w:top w:val="single" w:color="D9D9D9" w:sz="4" w:space="0"/>
-                          <w:left w:val="single" w:color="D9D9D9" w:sz="4" w:space="0"/>
-                          <w:bottom w:val="single" w:color="D9D9D9" w:sz="4" w:space="0"/>
-                          <w:right w:val="single" w:color="D9D9D9" w:sz="4" w:space="0"/>
+                          <w:top w:val="single" w:sz="4" w:space="0" w:color="D9D9D9"/>
+                          <w:left w:val="single" w:sz="4" w:space="0" w:color="D9D9D9"/>
+                          <w:bottom w:val="single" w:sz="4" w:space="0" w:color="D9D9D9"/>
+                          <w:right w:val="single" w:sz="4" w:space="0" w:color="D9D9D9"/>
                         </w:tcBorders>
                         <w:shd w:val="clear" w:color="auto" w:fill="FFFFFF"/>
                         <w:tcMar>
@@ -1139,9 +1106,6 @@
                         </w:tcMar>
                       </w:tcPr>
                       <w:p>
-                        <w:pPr>
-                          <w:jc w:val="both"/>
-                        </w:pPr>
                         <w:proofErr w:type="spellStart"/>
                         <w:r>
                           <w:t>OverallScoreTxt</w:t>
@@ -1153,24 +1117,24 @@
                 </w:sdt>
                 <w:sdt>
                   <w:sdtPr>
+                    <w:alias w:val="#Nav: /VendorScorecards/Rating"/>
+                    <w:tag w:val="#Nav: PCX_Purchase_Risk_Summary/51100"/>
                     <w:id w:val="1046717593"/>
                     <w:placeholder>
                       <w:docPart w:val="DefaultPlaceholder_-1854013440"/>
                     </w:placeholder>
                     <w:dataBinding w:prefixMappings="xmlns:ns0='urn:microsoft-dynamics-nav/reports/PCX_Purchase_Risk_Summary/51100/' " w:xpath="/ns0:NavWordReportXmlPart[1]/ns0:VendorScorecards[1]/ns0:Rating[1]" w:storeItemID="{DA5D4310-D13F-432C-84F0-FA8B9D237202}"/>
                     <w:text/>
-                    <w:alias w:val="#Nav: /VendorScorecards/Rating"/>
-                    <w:tag w:val="#Nav: PCX_Purchase_Risk_Summary/51100"/>
                   </w:sdtPr>
                   <w:sdtContent>
                     <w:tc>
                       <w:tcPr>
                         <w:tcW w:w="1800" w:type="dxa"/>
                         <w:tcBorders>
-                          <w:top w:val="single" w:color="D9D9D9" w:sz="4" w:space="0"/>
-                          <w:left w:val="single" w:color="D9D9D9" w:sz="4" w:space="0"/>
-                          <w:bottom w:val="single" w:color="D9D9D9" w:sz="4" w:space="0"/>
-                          <w:right w:val="single" w:color="D9D9D9" w:sz="4" w:space="0"/>
+                          <w:top w:val="single" w:sz="4" w:space="0" w:color="D9D9D9"/>
+                          <w:left w:val="single" w:sz="4" w:space="0" w:color="D9D9D9"/>
+                          <w:bottom w:val="single" w:sz="4" w:space="0" w:color="D9D9D9"/>
+                          <w:right w:val="single" w:sz="4" w:space="0" w:color="D9D9D9"/>
                         </w:tcBorders>
                         <w:shd w:val="clear" w:color="auto" w:fill="FFFFFF"/>
                         <w:tcMar>
@@ -1181,9 +1145,6 @@
                         </w:tcMar>
                       </w:tcPr>
                       <w:p>
-                        <w:pPr>
-                          <w:jc w:val="both"/>
-                        </w:pPr>
                         <w:r>
                           <w:t>Rating</w:t>
                         </w:r>
@@ -1850,9 +1811,11 @@
     <w:rsid w:val="00631DC8"/>
     <w:rsid w:val="00823F98"/>
     <w:rsid w:val="00A11A1D"/>
+    <w:rsid w:val="00AF49BF"/>
     <w:rsid w:val="00D221BD"/>
     <w:rsid w:val="00E507A4"/>
     <w:rsid w:val="00E96A68"/>
+    <w:rsid w:val="00F97A93"/>
   </w:rsids>
   <m:mathPr>
     <m:mathFont m:val="Cambria Math"/>
@@ -2321,18 +2284,6 @@
     <w:name w:val="0580506ADACC4BB399022E5AEC4852A3"/>
     <w:rsid w:val="00E96A68"/>
   </w:style>
-  <w:style w:type="paragraph" w:customStyle="1" w:styleId="40CDF30DA88248F782898BF3EFDD791D">
-    <w:name w:val="40CDF30DA88248F782898BF3EFDD791D"/>
-    <w:rsid w:val="004666C1"/>
-  </w:style>
-  <w:style w:type="paragraph" w:customStyle="1" w:styleId="8407124660E04B049C7D7EE2F6799A61">
-    <w:name w:val="8407124660E04B049C7D7EE2F6799A61"/>
-    <w:rsid w:val="004666C1"/>
-  </w:style>
-  <w:style w:type="paragraph" w:customStyle="1" w:styleId="0D953F2E972B4B3BB69702258F1BEC3C">
-    <w:name w:val="0D953F2E972B4B3BB69702258F1BEC3C"/>
-    <w:rsid w:val="004666C1"/>
-  </w:style>
 </w:styles>
 </file>
 
@@ -2658,7 +2609,7 @@
 </a:theme>
 </file>
 
-<file path=customXml/item1.xml>��< ? x m l   v e r s i o n = " 1 . 0 "   e n c o d i n g = " u t f - 1 6 " ? > < N a v W o r d R e p o r t X m l P a r t   x m l n s = " u r n : m i c r o s o f t - d y n a m i c s - b u s i n e s s c e n t r a l / i n t e r n a l / e x t e n d e d / r e p o r t s / P C X _ P u r c h a s e _ R i s k _ S u m m a r y / 5 1 1 0 0 / " > +<file path=customXml/item1.xml>��< ? x m l   v e r s i o n = " 1 . 0 "   e n c o d i n g = " u t f - 1 6 " ? > < N a v W o r d R e p o r t X m l P a r t   x m l n s = " u r n : m i c r o s o f t - d y n a m i c s - n a v / r e p o r t s / P C X _ P u r c h a s e _ R i s k _ S u m m a r y / 5 1 1 0 0 / " >   
      < B C R e p o r t I n f o r m a t i o n >   
@@ -2804,68 +2755,46 @@
  
      < / B C R e p o r t I n f o r m a t i o n >   
-     < T o o l t i p s > - 
-         < T o o l t i p   c o l u m n = " N o _ "   E l e m e n t I d = " 1 0 8 0 6 9 1 2 5 3 " > - 
-             < T o o l t i p T e x t   l a n g = " e n - U S " > S p e c i f i e s   a   u n i q u e   n u m b e r   t h a t   i d e n t i f i e s   t h e   p u r c h a s e   o r d e r .   T h e   n u m b e r   c a n   b e   g e n e r a t e d   a u t o m a t i c a l l y   f r o m   a   n u m b e r   s e r i e s ,   o r   y o u   c a n   n u m b e r   e a c h   o f   t h e m   m a n u a l l y . < / T o o l t i p T e x t > - 
-         < / T o o l t i p > - 
-         < T o o l t i p   c o l u m n = " B u y F r o m V e n d o r N o "   E l e m e n t I d = " 2 1 0 4 3 2 3 8 4 0 " > - 
-             < T o o l t i p T e x t   l a n g = " e n - U S " > S p e c i f i e s   t h e   v e n d o r   w h o   w i l l   d e l i v e r   t h e   g o o d s   o r   s e r v i c e s .   E a c h   v e n d o r   h a s   a   u n i q u e   n u m b e r   t o   h e l p   y o u   t r a c k   r e l a t e d   d o c u m e n t s .   T h e   n u m b e r   c a n   c o m e   f r o m   a   n u m b e r   s e r i e s   o r   b e   a d d e d   m a n u a l l y . < / T o o l t i p T e x t > - 
-         < / T o o l t i p > - 
-         < T o o l t i p   c o l u m n = " B u y F r o m V e n d o r N a m e "   E l e m e n t I d = " 1 7 7 6 2 5 1 2 9 4 " > - 
-             < T o o l t i p T e x t   l a n g = " e n - U S " > S p e c i f i e s   t h e   n a m e   o f   t h e   v e n d o r   t h a t   y o u  r e   b u y i n g   f r o m .   B y   d e f a u l t ,   t h e   s a m e   v e n d o r   i s   s u g g e s t e d   a s   t h e   p a y - t o   v e n d o r .   I f   n e e d e d ,   y o u   c a n   s p e c i f y   a   d i f f e r e n t   p a y - t o   v e n d o r   o n   t h e   d o c u m e n t . < / T o o l t i p T e x t > - 
-         < / T o o l t i p > - 
-     < / T o o l t i p s > - 
-     < O p e n R i s k O r d e r s   E l e m e n t T y p e = " D a t a I t e m "   E l e m e n t I d = " 1 6 9 4 5 1 3 7 4 3 " > - 
-         < B u y F r o m V e n d o r N a m e   E l e m e n t T y p e = " C o l u m n "   E l e m e n t I d = " 1 7 7 6 2 5 1 2 9 4 "   D a t a T y p e = " T e x t " > B u y F r o m V e n d o r N a m e < / B u y F r o m V e n d o r N a m e > - 
-         < B u y F r o m V e n d o r N o   E l e m e n t T y p e = " C o l u m n "   E l e m e n t I d = " 2 1 0 4 3 2 3 8 4 0 "   D a t a T y p e = " C o d e " > B u y F r o m V e n d o r N o < / B u y F r o m V e n d o r N o > - 
-         < C u r r e n t l y O v e r d u e   E l e m e n t T y p e = " C o l u m n "   E l e m e n t I d = " 2 0 1 4 7 8 0 3 5 5 "   D a t a T y p e = " B o o l e a n " > C u r r e n t l y O v e r d u e < / C u r r e n t l y O v e r d u e > - 
-         < H e a d e r T e x t _   E l e m e n t T y p e = " C o l u m n "   E l e m e n t I d = " 4 7 7 0 5 2 0 7 2 "   D a t a T y p e = " T e x t " > H e a d e r T e x t _ < / H e a d e r T e x t _ > - 
-         < M a t c h S t a t u s   E l e m e n t T y p e = " C o l u m n "   E l e m e n t I d = " 1 7 2 7 1 1 8 1 0 6 "   D a t a T y p e = " E n u m " > M a t c h S t a t u s < / M a t c h S t a t u s > - 
-         < N o _   E l e m e n t T y p e = " C o l u m n "   E l e m e n t I d = " 1 0 8 0 6 9 1 2 5 3 "   D a t a T y p e = " C o d e " > N o _ < / N o _ > - 
-         < R i s k L e v e l   E l e m e n t T y p e = " C o l u m n "   E l e m e n t I d = " 3 5 9 2 3 4 1 9 2 "   D a t a T y p e = " E n u m " > R i s k L e v e l < / R i s k L e v e l > +     < O p e n R i s k O r d e r s > + 
+         < B u y F r o m V e n d o r N a m e > B u y F r o m V e n d o r N a m e < / B u y F r o m V e n d o r N a m e > + 
+         < B u y F r o m V e n d o r N o > B u y F r o m V e n d o r N o < / B u y F r o m V e n d o r N o > + 
+         < C u r r e n t l y O v e r d u e > C u r r e n t l y O v e r d u e < / C u r r e n t l y O v e r d u e > + 
+         < H e a d e r T e x t _ > H e a d e r T e x t _ < / H e a d e r T e x t _ > + 
+         < M a t c h S t a t u s > M a t c h S t a t u s < / M a t c h S t a t u s > + 
+         < N o _ > N o _ < / N o _ > + 
+         < R i s k L e v e l > R i s k L e v e l < / R i s k L e v e l >   
      < / O p e n R i s k O r d e r s >   
-     < V e n d o r S c o r e c a r d s   E l e m e n t T y p e = " D a t a I t e m "   E l e m e n t I d = " 1 0 9 6 6 3 6 0 8 2 " > - 
-         < A s s e s s m e n t C o u n t   E l e m e n t T y p e = " C o l u m n "   E l e m e n t I d = " 5 9 8 6 7 8 3 6 0 "   D a t a T y p e = " I n t e g e r " > A s s e s s m e n t C o u n t < / A s s e s s m e n t C o u n t > - 
-         < O n T i m e P c t T x t   E l e m e n t T y p e = " C o l u m n "   E l e m e n t I d = " 9 5 6 1 4 8 1 2 2 "   D a t a T y p e = " T e x t " > O n T i m e P c t T x t < / O n T i m e P c t T x t > - 
-         < O v e r a l l S c o r e T x t   E l e m e n t T y p e = " C o l u m n "   E l e m e n t I d = " 1 7 2 3 4 1 3 5 2 2 "   D a t a T y p e = " T e x t " > O v e r a l l S c o r e T x t < / O v e r a l l S c o r e T x t > - 
-         < P r i c e A c c u r a c y P c t T x t   E l e m e n t T y p e = " C o l u m n "   E l e m e n t I d = " 1 1 0 2 0 8 8 9 1 8 "   D a t a T y p e = " T e x t " > P r i c e A c c u r a c y P c t T x t < / P r i c e A c c u r a c y P c t T x t > - 
-         < Q t y A c c u r a c y P c t T x t   E l e m e n t T y p e = " C o l u m n "   E l e m e n t I d = " 2 0 0 5 4 0 3 7 4 9 "   D a t a T y p e = " T e x t " > Q t y A c c u r a c y P c t T x t < / Q t y A c c u r a c y P c t T x t > - 
-         < R a t i n g   E l e m e n t T y p e = " C o l u m n "   E l e m e n t I d = " 5 4 1 9 8 6 2 9 8 "   D a t a T y p e = " E n u m " > R a t i n g < / R a t i n g > - 
-         < V e n d o r N o   E l e m e n t T y p e = " C o l u m n "   E l e m e n t I d = " 5 4 0 1 8 8 2 4 0 "   D a t a T y p e = " C o d e " > V e n d o r N o < / V e n d o r N o > +     < V e n d o r S c o r e c a r d s > + 
+         < A s s e s s m e n t C o u n t > A s s e s s m e n t C o u n t < / A s s e s s m e n t C o u n t > + 
+         < O n T i m e P c t T x t > O n T i m e P c t T x t < / O n T i m e P c t T x t > + 
+         < O v e r a l l S c o r e T x t > O v e r a l l S c o r e T x t < / O v e r a l l S c o r e T x t > + 
+         < P r i c e A c c u r a c y P c t T x t > P r i c e A c c u r a c y P c t T x t < / P r i c e A c c u r a c y P c t T x t > + 
+         < Q t y A c c u r a c y P c t T x t > Q t y A c c u r a c y P c t T x t < / Q t y A c c u r a c y P c t T x t > + 
+         < R a t i n g > R a t i n g < / R a t i n g > + 
+         < V e n d o r N o > V e n d o r N o < / V e n d o r N o >   
      < / V e n d o r S c o r e c a r d s >   
  < / N a v W o r d R e p o r t X m l P a r t > 
 </file>
 
-<file path=customXml/item2.xml>��< ? x m l   v e r s i o n = " 1 . 0 "   e n c o d i n g = " u t f - 1 6 " ? > < N a v W o r d R e p o r t X m l P a r t   x m l n s = " u r n : m i c r o s o f t - d y n a m i c s - n a v / r e p o r t s / P C X _ P u r c h a s e _ R i s k _ S u m m a r y / 5 1 1 0 0 / " > +<file path=customXml/item2.xml>��< ? x m l   v e r s i o n = " 1 . 0 "   e n c o d i n g = " u t f - 1 6 " ? > < N a v W o r d R e p o r t X m l P a r t   x m l n s = " u r n : m i c r o s o f t - d y n a m i c s - b u s i n e s s c e n t r a l / i n t e r n a l / e x t e n d e d / r e p o r t s / P C X _ P u r c h a s e _ R i s k _ S u m m a r y / 5 1 1 0 0 / " >   
      < B C R e p o r t I n f o r m a t i o n >   
@@ -3011,39 +2940,61 @@
  
      < / B C R e p o r t I n f o r m a t i o n >   
-     < O p e n R i s k O r d e r s > - 
-         < B u y F r o m V e n d o r N a m e > B u y F r o m V e n d o r N a m e < / B u y F r o m V e n d o r N a m e > - 
-         < B u y F r o m V e n d o r N o > B u y F r o m V e n d o r N o < / B u y F r o m V e n d o r N o > - 
-         < C u r r e n t l y O v e r d u e > C u r r e n t l y O v e r d u e < / C u r r e n t l y O v e r d u e > - 
-         < H e a d e r T e x t _ > H e a d e r T e x t _ < / H e a d e r T e x t _ > - 
-         < M a t c h S t a t u s > M a t c h S t a t u s < / M a t c h S t a t u s > - 
-         < N o _ > N o _ < / N o _ > - 
-         < R i s k L e v e l > R i s k L e v e l < / R i s k L e v e l > +     < T o o l t i p s > + 
+         < T o o l t i p   c o l u m n = " N o _ "   E l e m e n t I d = " 1 0 8 0 6 9 1 2 5 3 " > + 
+             < T o o l t i p T e x t   l a n g = " e n - U S " > S p e c i f i e s   a   u n i q u e   n u m b e r   t h a t   i d e n t i f i e s   t h e   p u r c h a s e   o r d e r .   T h e   n u m b e r   c a n   b e   g e n e r a t e d   a u t o m a t i c a l l y   f r o m   a   n u m b e r   s e r i e s ,   o r   y o u   c a n   n u m b e r   e a c h   o f   t h e m   m a n u a l l y . < / T o o l t i p T e x t > + 
+         < / T o o l t i p > + 
+         < T o o l t i p   c o l u m n = " B u y F r o m V e n d o r N o "   E l e m e n t I d = " 2 1 0 4 3 2 3 8 4 0 " > + 
+             < T o o l t i p T e x t   l a n g = " e n - U S " > S p e c i f i e s   t h e   v e n d o r   w h o   w i l l   d e l i v e r   t h e   g o o d s   o r   s e r v i c e s .   E a c h   v e n d o r   h a s   a   u n i q u e   n u m b e r   t o   h e l p   y o u   t r a c k   r e l a t e d   d o c u m e n t s .   T h e   n u m b e r   c a n   c o m e   f r o m   a   n u m b e r   s e r i e s   o r   b e   a d d e d   m a n u a l l y . < / T o o l t i p T e x t > + 
+         < / T o o l t i p > + 
+         < T o o l t i p   c o l u m n = " B u y F r o m V e n d o r N a m e "   E l e m e n t I d = " 1 7 7 6 2 5 1 2 9 4 " > + 
+             < T o o l t i p T e x t   l a n g = " e n - U S " > S p e c i f i e s   t h e   n a m e   o f   t h e   v e n d o r   t h a t   y o u  r e   b u y i n g   f r o m .   B y   d e f a u l t ,   t h e   s a m e   v e n d o r   i s   s u g g e s t e d   a s   t h e   p a y - t o   v e n d o r .   I f   n e e d e d ,   y o u   c a n   s p e c i f y   a   d i f f e r e n t   p a y - t o   v e n d o r   o n   t h e   d o c u m e n t . < / T o o l t i p T e x t > + 
+         < / T o o l t i p > + 
+     < / T o o l t i p s > + 
+     < O p e n R i s k O r d e r s   E l e m e n t T y p e = " D a t a I t e m "   E l e m e n t I d = " 1 6 9 4 5 1 3 7 4 3 " > + 
+         < B u y F r o m V e n d o r N a m e   E l e m e n t T y p e = " C o l u m n "   E l e m e n t I d = " 1 7 7 6 2 5 1 2 9 4 "   D a t a T y p e = " T e x t " > B u y F r o m V e n d o r N a m e < / B u y F r o m V e n d o r N a m e > + 
+         < B u y F r o m V e n d o r N o   E l e m e n t T y p e = " C o l u m n "   E l e m e n t I d = " 2 1 0 4 3 2 3 8 4 0 "   D a t a T y p e = " C o d e " > B u y F r o m V e n d o r N o < / B u y F r o m V e n d o r N o > + 
+         < C u r r e n t l y O v e r d u e   E l e m e n t T y p e = " C o l u m n "   E l e m e n t I d = " 2 0 1 4 7 8 0 3 5 5 "   D a t a T y p e = " B o o l e a n " > C u r r e n t l y O v e r d u e < / C u r r e n t l y O v e r d u e > + 
+         < H e a d e r T e x t _   E l e m e n t T y p e = " C o l u m n "   E l e m e n t I d = " 4 7 7 0 5 2 0 7 2 "   D a t a T y p e = " T e x t " > H e a d e r T e x t _ < / H e a d e r T e x t _ > + 
+         < M a t c h S t a t u s   E l e m e n t T y p e = " C o l u m n "   E l e m e n t I d = " 1 7 2 7 1 1 8 1 0 6 "   D a t a T y p e = " E n u m " > M a t c h S t a t u s < / M a t c h S t a t u s > + 
+         < N o _   E l e m e n t T y p e = " C o l u m n "   E l e m e n t I d = " 1 0 8 0 6 9 1 2 5 3 "   D a t a T y p e = " C o d e " > N o _ < / N o _ > + 
+         < R i s k L e v e l   E l e m e n t T y p e = " C o l u m n "   E l e m e n t I d = " 3 5 9 2 3 4 1 9 2 "   D a t a T y p e = " E n u m " > R i s k L e v e l < / R i s k L e v e l >   
      < / O p e n R i s k O r d e r s >   
-     < V e n d o r S c o r e c a r d s > - 
-         < A s s e s s m e n t C o u n t > A s s e s s m e n t C o u n t < / A s s e s s m e n t C o u n t > - 
-         < O n T i m e P c t T x t > O n T i m e P c t T x t < / O n T i m e P c t T x t > - 
-         < O v e r a l l S c o r e T x t > O v e r a l l S c o r e T x t < / O v e r a l l S c o r e T x t > - 
-         < P r i c e A c c u r a c y P c t T x t > P r i c e A c c u r a c y P c t T x t < / P r i c e A c c u r a c y P c t T x t > - 
-         < Q t y A c c u r a c y P c t T x t > Q t y A c c u r a c y P c t T x t < / Q t y A c c u r a c y P c t T x t > - 
-         < R a t i n g > R a t i n g < / R a t i n g > - 
-         < V e n d o r N o > V e n d o r N o < / V e n d o r N o > +     < V e n d o r S c o r e c a r d s   E l e m e n t T y p e = " D a t a I t e m "   E l e m e n t I d = " 1 0 9 6 6 3 6 0 8 2 " > + 
+         < A s s e s s m e n t C o u n t   E l e m e n t T y p e = " C o l u m n "   E l e m e n t I d = " 5 9 8 6 7 8 3 6 0 "   D a t a T y p e = " I n t e g e r " > A s s e s s m e n t C o u n t < / A s s e s s m e n t C o u n t > + 
+         < O n T i m e P c t T x t   E l e m e n t T y p e = " C o l u m n "   E l e m e n t I d = " 9 5 6 1 4 8 1 2 2 "   D a t a T y p e = " T e x t " > O n T i m e P c t T x t < / O n T i m e P c t T x t > + 
+         < O v e r a l l S c o r e T x t   E l e m e n t T y p e = " C o l u m n "   E l e m e n t I d = " 1 7 2 3 4 1 3 5 2 2 "   D a t a T y p e = " T e x t " > O v e r a l l S c o r e T x t < / O v e r a l l S c o r e T x t > + 
+         < P r i c e A c c u r a c y P c t T x t   E l e m e n t T y p e = " C o l u m n "   E l e m e n t I d = " 1 1 0 2 0 8 8 9 1 8 "   D a t a T y p e = " T e x t " > P r i c e A c c u r a c y P c t T x t < / P r i c e A c c u r a c y P c t T x t > + 
+         < Q t y A c c u r a c y P c t T x t   E l e m e n t T y p e = " C o l u m n "   E l e m e n t I d = " 2 0 0 5 4 0 3 7 4 9 "   D a t a T y p e = " T e x t " > Q t y A c c u r a c y P c t T x t < / Q t y A c c u r a c y P c t T x t > + 
+         < R a t i n g   E l e m e n t T y p e = " C o l u m n "   E l e m e n t I d = " 5 4 1 9 8 6 2 9 8 "   D a t a T y p e = " E n u m " > R a t i n g < / R a t i n g > + 
+         < V e n d o r N o   E l e m e n t T y p e = " C o l u m n "   E l e m e n t I d = " 5 4 0 1 8 8 2 4 0 "   D a t a T y p e = " C o d e " > V e n d o r N o < / V e n d o r N o >   
      < / V e n d o r S c o r e c a r d s >   
@@ -3051,17 +3002,17 @@
 </file>
 
 <file path=customXml/itemProps1.xml><?xml version="1.0" encoding="utf-8"?>
+<ds:datastoreItem xmlns:ds="http://schemas.openxmlformats.org/officeDocument/2006/customXml" ds:itemID="{DA5D4310-D13F-432C-84F0-FA8B9D237202}">
+  <ds:schemaRefs>
+    <ds:schemaRef ds:uri="urn:microsoft-dynamics-nav/reports/PCX_Purchase_Risk_Summary/51100/"/>
+  </ds:schemaRefs>
+</ds:datastoreItem>
+</file>
+
+<file path=customXml/itemProps2.xml><?xml version="1.0" encoding="utf-8"?>
 <ds:datastoreItem xmlns:ds="http://schemas.openxmlformats.org/officeDocument/2006/customXml" ds:itemID="{76C5242A-4FEA-4BC6-9549-3149EEF421EE}">
   <ds:schemaRefs>
     <ds:schemaRef ds:uri="urn:microsoft-dynamics-businesscentral/internal/extended/reports/PCX_Purchase_Risk_Summary/51100/"/>
   </ds:schemaRefs>
 </ds:datastoreItem>
-</file>
-
-<file path=customXml/itemProps2.xml><?xml version="1.0" encoding="utf-8"?>
-<ds:datastoreItem xmlns:ds="http://schemas.openxmlformats.org/officeDocument/2006/customXml" ds:itemID="{DA5D4310-D13F-432C-84F0-FA8B9D237202}">
-  <ds:schemaRefs>
-    <ds:schemaRef ds:uri="urn:microsoft-dynamics-nav/reports/PCX_Purchase_Risk_Summary/51100/"/>
-  </ds:schemaRefs>
-</ds:datastoreItem>
 </file>
</xml_diff>